<commit_message>
Compliance: frame responsibilities as the society's, remove sixth-form/under-18 programme references and the safeguarding-lead action
Co-Authored-By: Claude Sonnet 5.5 <noreply@anthropic.com>
</commit_message>
<xml_diff>
--- a/LACMS-Compliance-Report.docx
+++ b/LACMS-Compliance-Report.docx
@@ -370,7 +370,7 @@
             <w:r>
               <w:rPr>
                 <w:rFonts w:ascii="Consolas" w:hAnsi="Consolas"/>
-                <w:sz w:val="15"/>
+                <w:sz w:val="18"/>
               </w:rPr>
               <w:t>privacy.html</w:t>
             </w:r>
@@ -594,7 +594,7 @@
               <w:rPr>
                 <w:sz w:val="17"/>
               </w:rPr>
-              <w:t>Members download all their data instantly; the president can produce a file for anyone</w:t>
+              <w:t>Members download all their data instantly; the committee can produce a file for anyone</w:t>
             </w:r>
           </w:p>
         </w:tc>
@@ -666,7 +666,7 @@
               <w:rPr>
                 <w:sz w:val="17"/>
               </w:rPr>
-              <w:t>One president action erases the login and everything linked, removes copies kept by email address, anonymises what must stay, and lists what needs checking by hand</w:t>
+              <w:t>One committee action erases the login and everything linked, removes copies kept by email address, anonymises what must stay, and lists what needs checking by hand</w:t>
             </w:r>
           </w:p>
         </w:tc>
@@ -1026,7 +1026,7 @@
               <w:rPr>
                 <w:sz w:val="17"/>
               </w:rPr>
-              <w:t>Safeguarding page built from ULSU's policy (Safeguarding Officers, wellbeing contacts, Prevent, under-18s)</w:t>
+              <w:t>Safeguarding page built from ULSU's policy (Safeguarding Officers, wellbeing contacts, Prevent)</w:t>
             </w:r>
           </w:p>
         </w:tc>
@@ -1040,7 +1040,7 @@
               <w:rPr>
                 <w:sz w:val="17"/>
               </w:rPr>
-              <w:t>Done; named lead needed (10.8)</w:t>
+              <w:t>Done</w:t>
             </w:r>
           </w:p>
         </w:tc>
@@ -1513,7 +1513,7 @@
             <w:r>
               <w:rPr>
                 <w:rFonts w:ascii="Consolas" w:hAnsi="Consolas"/>
-                <w:sz w:val="15"/>
+                <w:sz w:val="18"/>
               </w:rPr>
               <w:t>compliance@lincolnsu.com</w:t>
             </w:r>
@@ -1526,7 +1526,7 @@
             <w:r>
               <w:rPr>
                 <w:rFonts w:ascii="Consolas" w:hAnsi="Consolas"/>
-                <w:sz w:val="15"/>
+                <w:sz w:val="18"/>
               </w:rPr>
               <w:t>complaints@lincolnsu.com</w:t>
             </w:r>
@@ -1548,7 +1548,7 @@
               <w:rPr>
                 <w:sz w:val="17"/>
               </w:rPr>
-              <w:t>Our notice uses the same rights list, the one-month time limit and the 30-day complaint acknowledgement; names the ULSU DPO and complaints contacts; email opt-out in place; under-18s minimised. Our retention periods are shorter than ULSU's for data we hold (ULSU keeps the master membership record).</w:t>
+              <w:t>Our notice uses the same rights list, the one-month time limit and the 30-day complaint acknowledgement; names the ULSU DPO and complaints contacts; email opt-out in place; children's data not collected knowingly. Our retention periods are shorter than ULSU's for data we hold (ULSU keeps the master membership record).</w:t>
             </w:r>
           </w:p>
         </w:tc>
@@ -1598,7 +1598,7 @@
               <w:rPr>
                 <w:sz w:val="17"/>
               </w:rPr>
-              <w:t>: committee members are "Student Volunteers" and must report concerns immediately to the Safeguarding Officers (Group Chief Executive and Deputy); do not investigate or promise confidentiality; wellbeing concerns go to University Student Wellbeing (01522 886400); Prevent duty is escalated by the Chief Executive; records kept with restricted access; under-18 safeguards</w:t>
+              <w:t>: committee members are "Student Volunteers" and must report concerns immediately to the Safeguarding Officers (Group Chief Executive and Deputy); do not investigate or promise confidentiality; wellbeing concerns go to University Student Wellbeing (01522 886400); Prevent duty is escalated by the Chief Executive; records kept with restricted access</w:t>
             </w:r>
           </w:p>
         </w:tc>
@@ -1611,7 +1611,7 @@
             <w:r>
               <w:rPr>
                 <w:rFonts w:ascii="Consolas" w:hAnsi="Consolas"/>
-                <w:sz w:val="15"/>
+                <w:sz w:val="18"/>
               </w:rPr>
               <w:t>safeguarding.html</w:t>
             </w:r>
@@ -1619,7 +1619,7 @@
               <w:rPr>
                 <w:sz w:val="17"/>
               </w:rPr>
-              <w:t xml:space="preserve"> states this route, the urgent-help numbers and the Prevent escalation; dashboard flags safeguarding requests with a reminder to pass them to ULSU and not investigate; chat reports kept as safeguarding records; under-18 safeguards described and enforced by the existing sixth-form rules</w:t>
+              <w:t xml:space="preserve"> states this route, the urgent-help numbers and the Prevent escalation; dashboard flags safeguarding requests with a reminder to pass them to ULSU and not investigate; chat reports kept as safeguarding records</w:t>
             </w:r>
           </w:p>
         </w:tc>
@@ -1739,7 +1739,7 @@
             <w:r>
               <w:rPr>
                 <w:rFonts w:ascii="Consolas" w:hAnsi="Consolas"/>
-                <w:sz w:val="15"/>
+                <w:sz w:val="18"/>
               </w:rPr>
               <w:t>acms@lincolnsu.com</w:t>
             </w:r>
@@ -2153,7 +2153,7 @@
             <w:r>
               <w:rPr>
                 <w:rFonts w:ascii="Consolas" w:hAnsi="Consolas"/>
-                <w:sz w:val="15"/>
+                <w:sz w:val="18"/>
               </w:rPr>
               <w:t>privacy_purge_expired()</w:t>
             </w:r>
@@ -2550,7 +2550,7 @@
               <w:rPr>
                 <w:sz w:val="17"/>
               </w:rPr>
-              <w:t xml:space="preserve"> to rehearse (10.9)</w:t>
+              <w:t xml:space="preserve"> to rehearse (10.8)</w:t>
             </w:r>
           </w:p>
         </w:tc>
@@ -2594,7 +2594,7 @@
               <w:rPr>
                 <w:sz w:val="17"/>
               </w:rPr>
-              <w:t>Summary DPIA in Appendix A (under-18s, wellbeing, heritage, messaging)</w:t>
+              <w:t>Summary DPIA in Appendix A (wellbeing, heritage, messaging)</w:t>
             </w:r>
           </w:p>
         </w:tc>
@@ -2645,7 +2645,7 @@
               <w:rPr>
                 <w:sz w:val="17"/>
               </w:rPr>
-              <w:t>Care with under-18s' data</w:t>
+              <w:t>Care with any child's data</w:t>
             </w:r>
           </w:p>
         </w:tc>
@@ -2659,7 +2659,7 @@
               <w:rPr>
                 <w:sz w:val="17"/>
               </w:rPr>
-              <w:t>Under-18s added only by the committee, names hidden, messaging restricted to executives, no profiling or marketing</w:t>
+              <w:t>The site is for adults; the notice says we don't knowingly collect children's data and will remove it if found</w:t>
             </w:r>
           </w:p>
         </w:tc>
@@ -2673,7 +2673,7 @@
               <w:rPr>
                 <w:sz w:val="17"/>
               </w:rPr>
-              <w:t>Done (10.8 for approvals)</w:t>
+              <w:t>Done</w:t>
             </w:r>
           </w:p>
         </w:tc>
@@ -2927,7 +2927,7 @@
               <w:rPr>
                 <w:sz w:val="17"/>
               </w:rPr>
-              <w:t>Done; audit recommended (10.10)</w:t>
+              <w:t>Done; audit recommended (10.9)</w:t>
             </w:r>
           </w:p>
         </w:tc>
@@ -3051,20 +3051,7 @@
               <w:rPr>
                 <w:sz w:val="17"/>
               </w:rPr>
-              <w:t xml:space="preserve">Done; </w:t>
-            </w:r>
-            <w:r>
-              <w:rPr>
-                <w:b/>
-                <w:sz w:val="17"/>
-              </w:rPr>
-              <w:t>Action needed</w:t>
-            </w:r>
-            <w:r>
-              <w:rPr>
-                <w:sz w:val="17"/>
-              </w:rPr>
-              <w:t xml:space="preserve"> (10.8)</w:t>
+              <w:t>Done</w:t>
             </w:r>
           </w:p>
         </w:tc>
@@ -3523,7 +3510,7 @@
             <w:r>
               <w:rPr>
                 <w:rFonts w:ascii="Consolas" w:hAnsi="Consolas"/>
-                <w:sz w:val="15"/>
+                <w:sz w:val="18"/>
               </w:rPr>
               <w:t>account_requests</w:t>
             </w:r>
@@ -3536,7 +3523,7 @@
             <w:r>
               <w:rPr>
                 <w:rFonts w:ascii="Consolas" w:hAnsi="Consolas"/>
-                <w:sz w:val="15"/>
+                <w:sz w:val="18"/>
               </w:rPr>
               <w:t>pending_members</w:t>
             </w:r>
@@ -3600,7 +3587,7 @@
               <w:rPr>
                 <w:sz w:val="17"/>
               </w:rPr>
-              <w:t>President and approvers</w:t>
+              <w:t>Committee (approvers)</w:t>
             </w:r>
           </w:p>
         </w:tc>
@@ -3635,7 +3622,7 @@
             <w:r>
               <w:rPr>
                 <w:rFonts w:ascii="Consolas" w:hAnsi="Consolas"/>
-                <w:sz w:val="15"/>
+                <w:sz w:val="18"/>
               </w:rPr>
               <w:t>members</w:t>
             </w:r>
@@ -3734,7 +3721,7 @@
             <w:r>
               <w:rPr>
                 <w:rFonts w:ascii="Consolas" w:hAnsi="Consolas"/>
-                <w:sz w:val="15"/>
+                <w:sz w:val="18"/>
               </w:rPr>
               <w:t>member_profiles</w:t>
             </w:r>
@@ -3833,7 +3820,7 @@
             <w:r>
               <w:rPr>
                 <w:rFonts w:ascii="Consolas" w:hAnsi="Consolas"/>
-                <w:sz w:val="15"/>
+                <w:sz w:val="18"/>
               </w:rPr>
               <w:t>members</w:t>
             </w:r>
@@ -3846,7 +3833,7 @@
             <w:r>
               <w:rPr>
                 <w:rFonts w:ascii="Consolas" w:hAnsi="Consolas"/>
-                <w:sz w:val="15"/>
+                <w:sz w:val="18"/>
               </w:rPr>
               <w:t>account_requests</w:t>
             </w:r>
@@ -3945,7 +3932,7 @@
             <w:r>
               <w:rPr>
                 <w:rFonts w:ascii="Consolas" w:hAnsi="Consolas"/>
-                <w:sz w:val="15"/>
+                <w:sz w:val="18"/>
               </w:rPr>
               <w:t>network_professionals</w:t>
             </w:r>
@@ -3958,7 +3945,7 @@
             <w:r>
               <w:rPr>
                 <w:rFonts w:ascii="Consolas" w:hAnsi="Consolas"/>
-                <w:sz w:val="15"/>
+                <w:sz w:val="18"/>
               </w:rPr>
               <w:t>professional_requests</w:t>
             </w:r>
@@ -4057,7 +4044,7 @@
             <w:r>
               <w:rPr>
                 <w:rFonts w:ascii="Consolas" w:hAnsi="Consolas"/>
-                <w:sz w:val="15"/>
+                <w:sz w:val="18"/>
               </w:rPr>
               <w:t>sankofa_mentor_applications</w:t>
             </w:r>
@@ -4070,7 +4057,7 @@
             <w:r>
               <w:rPr>
                 <w:rFonts w:ascii="Consolas" w:hAnsi="Consolas"/>
-                <w:sz w:val="15"/>
+                <w:sz w:val="18"/>
               </w:rPr>
               <w:t>sankofa_guest_mentors</w:t>
             </w:r>
@@ -4169,7 +4156,7 @@
             <w:r>
               <w:rPr>
                 <w:rFonts w:ascii="Consolas" w:hAnsi="Consolas"/>
-                <w:sz w:val="15"/>
+                <w:sz w:val="18"/>
               </w:rPr>
               <w:t>sankofa_*</w:t>
             </w:r>
@@ -4281,7 +4268,7 @@
             <w:r>
               <w:rPr>
                 <w:rFonts w:ascii="Consolas" w:hAnsi="Consolas"/>
-                <w:sz w:val="15"/>
+                <w:sz w:val="18"/>
               </w:rPr>
               <w:t>chat_*</w:t>
             </w:r>
@@ -4380,7 +4367,7 @@
             <w:r>
               <w:rPr>
                 <w:rFonts w:ascii="Consolas" w:hAnsi="Consolas"/>
-                <w:sz w:val="15"/>
+                <w:sz w:val="18"/>
               </w:rPr>
               <w:t>event_registrations</w:t>
             </w:r>
@@ -4393,7 +4380,7 @@
             <w:r>
               <w:rPr>
                 <w:rFonts w:ascii="Consolas" w:hAnsi="Consolas"/>
-                <w:sz w:val="15"/>
+                <w:sz w:val="18"/>
               </w:rPr>
               <w:t>motm_*</w:t>
             </w:r>
@@ -4406,7 +4393,7 @@
             <w:r>
               <w:rPr>
                 <w:rFonts w:ascii="Consolas" w:hAnsi="Consolas"/>
-                <w:sz w:val="15"/>
+                <w:sz w:val="18"/>
               </w:rPr>
               <w:t>news_*</w:t>
             </w:r>
@@ -4419,7 +4406,7 @@
             <w:r>
               <w:rPr>
                 <w:rFonts w:ascii="Consolas" w:hAnsi="Consolas"/>
-                <w:sz w:val="15"/>
+                <w:sz w:val="18"/>
               </w:rPr>
               <w:t>resource_*</w:t>
             </w:r>
@@ -4432,7 +4419,7 @@
             <w:r>
               <w:rPr>
                 <w:rFonts w:ascii="Consolas" w:hAnsi="Consolas"/>
-                <w:sz w:val="15"/>
+                <w:sz w:val="18"/>
               </w:rPr>
               <w:t>discount_usage</w:t>
             </w:r>
@@ -4445,7 +4432,7 @@
             <w:r>
               <w:rPr>
                 <w:rFonts w:ascii="Consolas" w:hAnsi="Consolas"/>
-                <w:sz w:val="15"/>
+                <w:sz w:val="18"/>
               </w:rPr>
               <w:t>member_*</w:t>
             </w:r>
@@ -4544,7 +4531,7 @@
             <w:r>
               <w:rPr>
                 <w:rFonts w:ascii="Consolas" w:hAnsi="Consolas"/>
-                <w:sz w:val="15"/>
+                <w:sz w:val="18"/>
               </w:rPr>
               <w:t>event_feedback</w:t>
             </w:r>
@@ -4643,7 +4630,7 @@
             <w:r>
               <w:rPr>
                 <w:rFonts w:ascii="Consolas" w:hAnsi="Consolas"/>
-                <w:sz w:val="15"/>
+                <w:sz w:val="18"/>
               </w:rPr>
               <w:t>page_views</w:t>
             </w:r>
@@ -4656,7 +4643,7 @@
             <w:r>
               <w:rPr>
                 <w:rFonts w:ascii="Consolas" w:hAnsi="Consolas"/>
-                <w:sz w:val="15"/>
+                <w:sz w:val="18"/>
               </w:rPr>
               <w:t>qr_scans</w:t>
             </w:r>
@@ -4727,7 +4714,7 @@
               <w:rPr>
                 <w:sz w:val="17"/>
               </w:rPr>
-              <w:t>President</w:t>
+              <w:t>Committee</w:t>
             </w:r>
           </w:p>
         </w:tc>
@@ -4762,7 +4749,7 @@
             <w:r>
               <w:rPr>
                 <w:rFonts w:ascii="Consolas" w:hAnsi="Consolas"/>
-                <w:sz w:val="15"/>
+                <w:sz w:val="18"/>
               </w:rPr>
               <w:t>email_log</w:t>
             </w:r>
@@ -4775,7 +4762,7 @@
             <w:r>
               <w:rPr>
                 <w:rFonts w:ascii="Consolas" w:hAnsi="Consolas"/>
-                <w:sz w:val="15"/>
+                <w:sz w:val="18"/>
               </w:rPr>
               <w:t>*_emails</w:t>
             </w:r>
@@ -4839,7 +4826,7 @@
               <w:rPr>
                 <w:sz w:val="17"/>
               </w:rPr>
-              <w:t>President</w:t>
+              <w:t>Committee</w:t>
             </w:r>
           </w:p>
         </w:tc>
@@ -4874,7 +4861,7 @@
             <w:r>
               <w:rPr>
                 <w:rFonts w:ascii="Consolas" w:hAnsi="Consolas"/>
-                <w:sz w:val="15"/>
+                <w:sz w:val="18"/>
               </w:rPr>
               <w:t>view_as_log</w:t>
             </w:r>
@@ -4938,7 +4925,7 @@
               <w:rPr>
                 <w:sz w:val="17"/>
               </w:rPr>
-              <w:t>President</w:t>
+              <w:t>Committee</w:t>
             </w:r>
           </w:p>
         </w:tc>
@@ -4973,7 +4960,7 @@
             <w:r>
               <w:rPr>
                 <w:rFonts w:ascii="Consolas" w:hAnsi="Consolas"/>
-                <w:sz w:val="15"/>
+                <w:sz w:val="18"/>
               </w:rPr>
               <w:t>compliance_requests</w:t>
             </w:r>
@@ -5037,7 +5024,7 @@
               <w:rPr>
                 <w:sz w:val="17"/>
               </w:rPr>
-              <w:t>President</w:t>
+              <w:t>Committee</w:t>
             </w:r>
           </w:p>
         </w:tc>
@@ -5072,7 +5059,7 @@
             <w:r>
               <w:rPr>
                 <w:rFonts w:ascii="Consolas" w:hAnsi="Consolas"/>
-                <w:sz w:val="15"/>
+                <w:sz w:val="18"/>
               </w:rPr>
               <w:t>email_preferences</w:t>
             </w:r>
@@ -5085,7 +5072,7 @@
             <w:r>
               <w:rPr>
                 <w:rFonts w:ascii="Consolas" w:hAnsi="Consolas"/>
-                <w:sz w:val="15"/>
+                <w:sz w:val="18"/>
               </w:rPr>
               <w:t>privacy_acknowledgements</w:t>
             </w:r>
@@ -5149,7 +5136,7 @@
               <w:rPr>
                 <w:sz w:val="17"/>
               </w:rPr>
-              <w:t>The person; president (opt-out list)</w:t>
+              <w:t>The person; committee (opt-out list)</w:t>
             </w:r>
           </w:p>
         </w:tc>
@@ -5184,7 +5171,7 @@
             <w:r>
               <w:rPr>
                 <w:rFonts w:ascii="Consolas" w:hAnsi="Consolas"/>
-                <w:sz w:val="15"/>
+                <w:sz w:val="18"/>
               </w:rPr>
               <w:t>gallery_photos</w:t>
             </w:r>
@@ -5197,7 +5184,7 @@
             <w:r>
               <w:rPr>
                 <w:rFonts w:ascii="Consolas" w:hAnsi="Consolas"/>
-                <w:sz w:val="15"/>
+                <w:sz w:val="18"/>
               </w:rPr>
               <w:t>committee_members</w:t>
             </w:r>
@@ -5210,7 +5197,7 @@
             <w:r>
               <w:rPr>
                 <w:rFonts w:ascii="Consolas" w:hAnsi="Consolas"/>
-                <w:sz w:val="15"/>
+                <w:sz w:val="18"/>
               </w:rPr>
               <w:t>motm_winners</w:t>
             </w:r>
@@ -6147,15 +6134,7 @@
         <w:pStyle w:val="ListBullet"/>
       </w:pPr>
       <w:r>
-        <w:t>Private chat messages are never shown in the president's "view as" preview; previews are read-only and logged.</w:t>
-      </w:r>
-    </w:p>
-    <w:p>
-      <w:pPr>
-        <w:pStyle w:val="ListBullet"/>
-      </w:pPr>
-      <w:r>
-        <w:t>Sixth-form members' names are hidden from everyone except the executive committee, and they can only be messaged by executives.</w:t>
+        <w:t>Private chat messages are never shown in the committee's "view as" preview; previews are read-only and logged.</w:t>
       </w:r>
     </w:p>
     <w:p>
@@ -6181,7 +6160,7 @@
         <w:pStyle w:val="ListBullet"/>
       </w:pPr>
       <w:r>
-        <w:t>Every erasure, export, request and clean-up action runs through president-only database functions (migration 110); none of the new tables is directly readable.</w:t>
+        <w:t>Every erasure, export, request and clean-up action runs through administrator-only database functions (migration 110); none of the new tables is directly readable.</w:t>
       </w:r>
     </w:p>
     <w:p>
@@ -6743,7 +6722,7 @@
         <w:t>president-dashboard.html</w:t>
       </w:r>
       <w:r>
-        <w:t xml:space="preserve"> (Data &amp; Privacy section); </w:t>
+        <w:t xml:space="preserve"> (the committee dashboard; Data &amp; Privacy section); </w:t>
       </w:r>
       <w:r>
         <w:rPr>
@@ -7076,12 +7055,12 @@
               <w:rPr>
                 <w:sz w:val="17"/>
               </w:rPr>
-              <w:t>President / ULSU Student Communities and DPO (</w:t>
+              <w:t>Committee, with ULSU Student Communities and DPO (</w:t>
             </w:r>
             <w:r>
               <w:rPr>
                 <w:rFonts w:ascii="Consolas" w:hAnsi="Consolas"/>
-                <w:sz w:val="15"/>
+                <w:sz w:val="18"/>
               </w:rPr>
               <w:t>compliance@lincolnsu.com</w:t>
             </w:r>
@@ -7146,7 +7125,7 @@
             <w:r>
               <w:rPr>
                 <w:rFonts w:ascii="Consolas" w:hAnsi="Consolas"/>
-                <w:sz w:val="15"/>
+                <w:sz w:val="18"/>
               </w:rPr>
               <w:t>send-account-email</w:t>
             </w:r>
@@ -7159,7 +7138,7 @@
             <w:r>
               <w:rPr>
                 <w:rFonts w:ascii="Consolas" w:hAnsi="Consolas"/>
-                <w:sz w:val="15"/>
+                <w:sz w:val="18"/>
               </w:rPr>
               <w:t>send-member-email</w:t>
             </w:r>
@@ -7350,7 +7329,7 @@
               <w:rPr>
                 <w:sz w:val="17"/>
               </w:rPr>
-              <w:t xml:space="preserve"> for every account behind the site (Supabase, GitHub, Resend, domain registrar, the president and any executive with dashboard access). In Supabase enable leaked-password protection. Confirm "Enforce HTTPS" is on in GitHub Pages.</w:t>
+              <w:t xml:space="preserve"> for every account behind the site (Supabase, GitHub, Resend, domain registrar, and every committee member with dashboard access). In Supabase enable leaked-password protection. Confirm "Enforce HTTPS" is on in GitHub Pages.</w:t>
             </w:r>
           </w:p>
         </w:tc>
@@ -7435,7 +7414,7 @@
               <w:rPr>
                 <w:sz w:val="17"/>
               </w:rPr>
-              <w:t>President</w:t>
+              <w:t>Committee</w:t>
             </w:r>
           </w:p>
         </w:tc>
@@ -7506,7 +7485,7 @@
               <w:rPr>
                 <w:sz w:val="17"/>
               </w:rPr>
-              <w:t>President / ULSU</w:t>
+              <w:t>Committee, with ULSU</w:t>
             </w:r>
           </w:p>
         </w:tc>
@@ -7563,7 +7542,7 @@
             <w:r>
               <w:rPr>
                 <w:rFonts w:ascii="Consolas" w:hAnsi="Consolas"/>
-                <w:sz w:val="15"/>
+                <w:sz w:val="18"/>
               </w:rPr>
               <w:t>acms@lincolnsu.com</w:t>
             </w:r>
@@ -7571,7 +7550,7 @@
               <w:rPr>
                 <w:sz w:val="17"/>
               </w:rPr>
-              <w:t xml:space="preserve"> (not a personal address) and is handed to ULSU at each annual handover; ask ULSU whether this independent website needs its approval under the social media policy; keep the ULSU logo off it unless approved (it currently isn't used). The site is currently built and run by one person (see the page banner), so a second trusted administrator is needed so the society's data isn't stranded.</w:t>
+              <w:t xml:space="preserve"> (not a personal address) and is handed to ULSU at each annual handover; ask ULSU whether this independent website needs its approval under the social media policy; keep the ULSU logo off it unless approved (it currently isn't used). The site is currently run by a single volunteer, so the society needs a second trusted administrator so its data isn't stranded when committees change.</w:t>
             </w:r>
           </w:p>
         </w:tc>
@@ -7585,7 +7564,7 @@
               <w:rPr>
                 <w:sz w:val="17"/>
               </w:rPr>
-              <w:t>President / ULSU</w:t>
+              <w:t>Committee, with ULSU</w:t>
             </w:r>
           </w:p>
         </w:tc>
@@ -7613,10 +7592,9 @@
             <w:r/>
             <w:r>
               <w:rPr>
-                <w:b/>
-                <w:sz w:val="17"/>
-              </w:rPr>
-              <w:t>High</w:t>
+                <w:sz w:val="17"/>
+              </w:rPr>
+              <w:t>Medium</w:t>
             </w:r>
           </w:p>
         </w:tc>
@@ -7628,29 +7606,9 @@
             <w:r/>
             <w:r>
               <w:rPr>
-                <w:b/>
-                <w:sz w:val="17"/>
-              </w:rPr>
-              <w:t>Safeguarding:</w:t>
-            </w:r>
-            <w:r>
-              <w:rPr>
-                <w:sz w:val="17"/>
-              </w:rPr>
-              <w:t xml:space="preserve"> appoint a named committee safeguarding contact; committee to complete ULSU safeguarding and data protection training; take ULSU's advice on any activity involving under-18s (for example mentoring sixth-formers), including whether mentors need DBS checks and how parental awareness is handled. </w:t>
-            </w:r>
-            <w:r>
-              <w:rPr>
-                <w:b/>
-                <w:sz w:val="17"/>
-              </w:rPr>
-              <w:t>Check whether any under-18s are currently in the Hub</w:t>
-            </w:r>
-            <w:r>
-              <w:rPr>
-                <w:sz w:val="17"/>
-              </w:rPr>
-              <w:t>; if so, ULSU should be told.</w:t>
+                <w:sz w:val="17"/>
+              </w:rPr>
+              <w:t>Rehearse the breach procedure once (who to call, where the log is).</w:t>
             </w:r>
           </w:p>
         </w:tc>
@@ -7664,7 +7622,7 @@
               <w:rPr>
                 <w:sz w:val="17"/>
               </w:rPr>
-              <w:t>President / ULSU Safeguarding Officers</w:t>
+              <w:t>Committee</w:t>
             </w:r>
           </w:p>
         </w:tc>
@@ -7708,7 +7666,20 @@
               <w:rPr>
                 <w:sz w:val="17"/>
               </w:rPr>
-              <w:t>Rehearse the breach procedure once (who to call, where the log is).</w:t>
+              <w:t xml:space="preserve">Commission an </w:t>
+            </w:r>
+            <w:r>
+              <w:rPr>
+                <w:b/>
+                <w:sz w:val="17"/>
+              </w:rPr>
+              <w:t>independent accessibility audit</w:t>
+            </w:r>
+            <w:r>
+              <w:rPr>
+                <w:sz w:val="17"/>
+              </w:rPr>
+              <w:t xml:space="preserve"> (WCAG 2.2 AA) and update the accessibility statement with the result.</w:t>
             </w:r>
           </w:p>
         </w:tc>
@@ -7766,20 +7737,7 @@
               <w:rPr>
                 <w:sz w:val="17"/>
               </w:rPr>
-              <w:t xml:space="preserve">Commission an </w:t>
-            </w:r>
-            <w:r>
-              <w:rPr>
-                <w:b/>
-                <w:sz w:val="17"/>
-              </w:rPr>
-              <w:t>independent accessibility audit</w:t>
-            </w:r>
-            <w:r>
-              <w:rPr>
-                <w:sz w:val="17"/>
-              </w:rPr>
-              <w:t xml:space="preserve"> (WCAG 2.2 AA) and update the accessibility statement with the result.</w:t>
+              <w:t>Read the ULSU documents only skimmed in this review (section 2) and tell us if anything conflicts.</w:t>
             </w:r>
           </w:p>
         </w:tc>
@@ -7837,7 +7795,20 @@
               <w:rPr>
                 <w:sz w:val="17"/>
               </w:rPr>
-              <w:t>Read the ULSU documents only skimmed in this review (section 2) and tell us if anything conflicts.</w:t>
+              <w:t xml:space="preserve">Confirm winners' </w:t>
+            </w:r>
+            <w:r>
+              <w:rPr>
+                <w:b/>
+                <w:sz w:val="17"/>
+              </w:rPr>
+              <w:t>consent before publishing</w:t>
+            </w:r>
+            <w:r>
+              <w:rPr>
+                <w:sz w:val="17"/>
+              </w:rPr>
+              <w:t xml:space="preserve"> Member of the Month entries and committee photos; the notice says winners are shown but does not claim a recorded consent.</w:t>
             </w:r>
           </w:p>
         </w:tc>
@@ -7881,7 +7852,7 @@
               <w:rPr>
                 <w:sz w:val="17"/>
               </w:rPr>
-              <w:t>Medium</w:t>
+              <w:t>Low</w:t>
             </w:r>
           </w:p>
         </w:tc>
@@ -7895,20 +7866,46 @@
               <w:rPr>
                 <w:sz w:val="17"/>
               </w:rPr>
-              <w:t xml:space="preserve">Confirm winners' </w:t>
-            </w:r>
-            <w:r>
-              <w:rPr>
-                <w:b/>
-                <w:sz w:val="17"/>
-              </w:rPr>
-              <w:t>consent before publishing</w:t>
-            </w:r>
-            <w:r>
-              <w:rPr>
-                <w:sz w:val="17"/>
-              </w:rPr>
-              <w:t xml:space="preserve"> Member of the Month entries and committee photos; the notice says winners are shown but does not claim a recorded consent.</w:t>
+              <w:t xml:space="preserve">Review the privacy notice, terms and this report every year, or whenever a new feature collects new data (for example update </w:t>
+            </w:r>
+            <w:r>
+              <w:rPr>
+                <w:rFonts w:ascii="Consolas" w:hAnsi="Consolas"/>
+                <w:sz w:val="18"/>
+              </w:rPr>
+              <w:t>privacy.html</w:t>
+            </w:r>
+            <w:r>
+              <w:rPr>
+                <w:sz w:val="17"/>
+              </w:rPr>
+              <w:t xml:space="preserve"> and bump </w:t>
+            </w:r>
+            <w:r>
+              <w:rPr>
+                <w:rFonts w:ascii="Consolas" w:hAnsi="Consolas"/>
+                <w:sz w:val="18"/>
+              </w:rPr>
+              <w:t>PRIVACY_VERSION</w:t>
+            </w:r>
+            <w:r>
+              <w:rPr>
+                <w:sz w:val="17"/>
+              </w:rPr>
+              <w:t xml:space="preserve"> in </w:t>
+            </w:r>
+            <w:r>
+              <w:rPr>
+                <w:rFonts w:ascii="Consolas" w:hAnsi="Consolas"/>
+                <w:sz w:val="18"/>
+              </w:rPr>
+              <w:t>js/privacy.js</w:t>
+            </w:r>
+            <w:r>
+              <w:rPr>
+                <w:sz w:val="17"/>
+              </w:rPr>
+              <w:t>).</w:t>
             </w:r>
           </w:p>
         </w:tc>
@@ -7939,103 +7936,6 @@
                 <w:sz w:val="17"/>
               </w:rPr>
               <w:t>10.13</w:t>
-            </w:r>
-          </w:p>
-        </w:tc>
-        <w:tc>
-          <w:tcPr>
-            <w:tcW w:type="dxa" w:w="2493"/>
-          </w:tcPr>
-          <w:p>
-            <w:r/>
-            <w:r>
-              <w:rPr>
-                <w:sz w:val="17"/>
-              </w:rPr>
-              <w:t>Low</w:t>
-            </w:r>
-          </w:p>
-        </w:tc>
-        <w:tc>
-          <w:tcPr>
-            <w:tcW w:type="dxa" w:w="2493"/>
-          </w:tcPr>
-          <w:p>
-            <w:r/>
-            <w:r>
-              <w:rPr>
-                <w:sz w:val="17"/>
-              </w:rPr>
-              <w:t xml:space="preserve">Review the privacy notice, terms and this report every year, or whenever a new feature collects new data (for example update </w:t>
-            </w:r>
-            <w:r>
-              <w:rPr>
-                <w:rFonts w:ascii="Consolas" w:hAnsi="Consolas"/>
-                <w:sz w:val="15"/>
-              </w:rPr>
-              <w:t>privacy.html</w:t>
-            </w:r>
-            <w:r>
-              <w:rPr>
-                <w:sz w:val="17"/>
-              </w:rPr>
-              <w:t xml:space="preserve"> and bump </w:t>
-            </w:r>
-            <w:r>
-              <w:rPr>
-                <w:rFonts w:ascii="Consolas" w:hAnsi="Consolas"/>
-                <w:sz w:val="15"/>
-              </w:rPr>
-              <w:t>PRIVACY_VERSION</w:t>
-            </w:r>
-            <w:r>
-              <w:rPr>
-                <w:sz w:val="17"/>
-              </w:rPr>
-              <w:t xml:space="preserve"> in </w:t>
-            </w:r>
-            <w:r>
-              <w:rPr>
-                <w:rFonts w:ascii="Consolas" w:hAnsi="Consolas"/>
-                <w:sz w:val="15"/>
-              </w:rPr>
-              <w:t>js/privacy.js</w:t>
-            </w:r>
-            <w:r>
-              <w:rPr>
-                <w:sz w:val="17"/>
-              </w:rPr>
-              <w:t>).</w:t>
-            </w:r>
-          </w:p>
-        </w:tc>
-        <w:tc>
-          <w:tcPr>
-            <w:tcW w:type="dxa" w:w="2493"/>
-          </w:tcPr>
-          <w:p>
-            <w:r/>
-            <w:r>
-              <w:rPr>
-                <w:sz w:val="17"/>
-              </w:rPr>
-              <w:t>President</w:t>
-            </w:r>
-          </w:p>
-        </w:tc>
-      </w:tr>
-      <w:tr>
-        <w:tc>
-          <w:tcPr>
-            <w:tcW w:type="dxa" w:w="2493"/>
-          </w:tcPr>
-          <w:p>
-            <w:r/>
-            <w:r>
-              <w:rPr>
-                <w:sz w:val="17"/>
-              </w:rPr>
-              <w:t>10.14</w:t>
             </w:r>
           </w:p>
         </w:tc>
@@ -8103,7 +8003,7 @@
         <w:t>Database (migration 110):</w:t>
       </w:r>
       <w:r>
-        <w:t xml:space="preserve"> 62 automated checks against a clean PostgreSQL instance with stand-in tables (public submissions and rate limit, permissions for anonymous/member/president, export contents and exclusion of other people's data, full erasure with cascades and anonymisation, retention deletes old and keeps new, inactive accounts, email preferences, privacy acknowledgement). All passed. It was </w:t>
+        <w:t xml:space="preserve"> 62 automated checks against a clean PostgreSQL instance with stand-in tables (public submissions and rate limit, permissions for anonymous, member and administrator, export contents and exclusion of other people's data, full erasure with cascades and anonymisation, retention deletes old and keeps new, inactive accounts, email preferences, privacy acknowledgement). All passed. It was </w:t>
       </w:r>
       <w:r>
         <w:rPr>
@@ -8126,7 +8026,7 @@
         <w:t>Browser:</w:t>
       </w:r>
       <w:r>
-        <w:t xml:space="preserve"> consent banner (no storage or recording before consent, deletion of the visitor ID on withdrawal, Do Not Track), cookie settings, data-rights form (validation, honeypot, submission, confirmation), members hub "My data and privacy" (download, email preference, deletion request, request list), president dashboard "Data &amp; Privacy" (queue, overdue and safeguarding flags, status save, export, erase, clean-up, inactive accounts). These ran against a mock server, not the live back end.</w:t>
+        <w:t xml:space="preserve"> consent banner (no storage or recording before consent, deletion of the visitor ID on withdrawal, Do Not Track), cookie settings, data-rights form (validation, honeypot, submission, confirmation), members hub "My data and privacy" (download, email preference, deletion request, request list), committee dashboard "Data &amp; Privacy" (queue, overdue and safeguarding flags, status save, export, erase, clean-up, inactive accounts). These ran against a mock server, not the live back end.</w:t>
       </w:r>
     </w:p>
     <w:p>
@@ -8173,7 +8073,7 @@
         <w:t>Processing:</w:t>
       </w:r>
       <w:r>
-        <w:t xml:space="preserve"> Sankofa mentoring Hub (wellbeing check-ins, optional heritage), private messaging, and any involvement of under-18s.</w:t>
+        <w:t xml:space="preserve"> Sankofa mentoring Hub (wellbeing check-ins, optional heritage), and private messaging.</w:t>
       </w:r>
     </w:p>
     <w:tbl>
@@ -8431,78 +8331,6 @@
                 <w:sz w:val="17"/>
               </w:rPr>
               <w:t>Low</w:t>
-            </w:r>
-          </w:p>
-        </w:tc>
-      </w:tr>
-      <w:tr>
-        <w:tc>
-          <w:tcPr>
-            <w:tcW w:type="dxa" w:w="1994"/>
-          </w:tcPr>
-          <w:p>
-            <w:r/>
-            <w:r>
-              <w:rPr>
-                <w:sz w:val="17"/>
-              </w:rPr>
-              <w:t>Under-18 contacted inappropriately</w:t>
-            </w:r>
-          </w:p>
-        </w:tc>
-        <w:tc>
-          <w:tcPr>
-            <w:tcW w:type="dxa" w:w="1994"/>
-          </w:tcPr>
-          <w:p>
-            <w:r/>
-            <w:r>
-              <w:rPr>
-                <w:sz w:val="17"/>
-              </w:rPr>
-              <w:t>Low</w:t>
-            </w:r>
-          </w:p>
-        </w:tc>
-        <w:tc>
-          <w:tcPr>
-            <w:tcW w:type="dxa" w:w="1994"/>
-          </w:tcPr>
-          <w:p>
-            <w:r/>
-            <w:r>
-              <w:rPr>
-                <w:sz w:val="17"/>
-              </w:rPr>
-              <w:t>Very high</w:t>
-            </w:r>
-          </w:p>
-        </w:tc>
-        <w:tc>
-          <w:tcPr>
-            <w:tcW w:type="dxa" w:w="1994"/>
-          </w:tcPr>
-          <w:p>
-            <w:r/>
-            <w:r>
-              <w:rPr>
-                <w:sz w:val="17"/>
-              </w:rPr>
-              <w:t>Committee-only addition; names hidden; only executives can message them; no marketing</w:t>
-            </w:r>
-          </w:p>
-        </w:tc>
-        <w:tc>
-          <w:tcPr>
-            <w:tcW w:type="dxa" w:w="1994"/>
-          </w:tcPr>
-          <w:p>
-            <w:r/>
-            <w:r>
-              <w:rPr>
-                <w:sz w:val="17"/>
-              </w:rPr>
-              <w:t>Low, pending ULSU approval (10.8)</w:t>
             </w:r>
           </w:p>
         </w:tc>

</xml_diff>

<commit_message>
Privacy notice: remove the 'who we use to run the website' section; restore safeguarding contact action (without under-18 content)
Co-Authored-By: Claude Sonnet 5.5 <noreply@anthropic.com>
</commit_message>
<xml_diff>
--- a/LACMS-Compliance-Report.docx
+++ b/LACMS-Compliance-Report.docx
@@ -1040,7 +1040,7 @@
               <w:rPr>
                 <w:sz w:val="17"/>
               </w:rPr>
-              <w:t>Done</w:t>
+              <w:t>Done; contact person needed (10.8)</w:t>
             </w:r>
           </w:p>
         </w:tc>
@@ -2550,7 +2550,7 @@
               <w:rPr>
                 <w:sz w:val="17"/>
               </w:rPr>
-              <w:t xml:space="preserve"> to rehearse (10.8)</w:t>
+              <w:t xml:space="preserve"> to rehearse (10.9)</w:t>
             </w:r>
           </w:p>
         </w:tc>
@@ -2927,7 +2927,7 @@
               <w:rPr>
                 <w:sz w:val="17"/>
               </w:rPr>
-              <w:t>Done; audit recommended (10.9)</w:t>
+              <w:t>Done; audit recommended (10.10)</w:t>
             </w:r>
           </w:p>
         </w:tc>
@@ -3051,7 +3051,20 @@
               <w:rPr>
                 <w:sz w:val="17"/>
               </w:rPr>
-              <w:t>Done</w:t>
+              <w:t xml:space="preserve">Done; </w:t>
+            </w:r>
+            <w:r>
+              <w:rPr>
+                <w:b/>
+                <w:sz w:val="17"/>
+              </w:rPr>
+              <w:t>Action needed</w:t>
+            </w:r>
+            <w:r>
+              <w:rPr>
+                <w:sz w:val="17"/>
+              </w:rPr>
+              <w:t xml:space="preserve"> (10.8)</w:t>
             </w:r>
           </w:p>
         </w:tc>
@@ -5694,7 +5707,13 @@
     <w:p/>
     <w:p>
       <w:r>
-        <w:t xml:space="preserve">The notice tells visitors about these providers. </w:t>
+        <w:rPr>
+          <w:b/>
+        </w:rPr>
+        <w:t>Note:</w:t>
+      </w:r>
+      <w:r>
+        <w:t xml:space="preserve"> at the committee's request the privacy notice no longer has a section naming these providers or describing transfers outside the UK. UK GDPR Article 13 normally expects a notice to say who receives personal data and about any overseas transfers, so this is an open risk (10.3).  </w:t>
       </w:r>
       <w:r>
         <w:rPr>
@@ -7257,7 +7276,7 @@
               <w:rPr>
                 <w:sz w:val="17"/>
               </w:rPr>
-              <w:t xml:space="preserve"> and update the notice if you want to name it.</w:t>
+              <w:t>. Decide with ULSU whether the privacy notice should describe recipients and overseas transfers (it currently doesn't).</w:t>
             </w:r>
           </w:p>
         </w:tc>
@@ -7592,9 +7611,10 @@
             <w:r/>
             <w:r>
               <w:rPr>
-                <w:sz w:val="17"/>
-              </w:rPr>
-              <w:t>Medium</w:t>
+                <w:b/>
+                <w:sz w:val="17"/>
+              </w:rPr>
+              <w:t>High</w:t>
             </w:r>
           </w:p>
         </w:tc>
@@ -7606,9 +7626,16 @@
             <w:r/>
             <w:r>
               <w:rPr>
-                <w:sz w:val="17"/>
-              </w:rPr>
-              <w:t>Rehearse the breach procedure once (who to call, where the log is).</w:t>
+                <w:b/>
+                <w:sz w:val="17"/>
+              </w:rPr>
+              <w:t>Safeguarding:</w:t>
+            </w:r>
+            <w:r>
+              <w:rPr>
+                <w:sz w:val="17"/>
+              </w:rPr>
+              <w:t xml:space="preserve"> agree who on the committee is the point of contact for passing safeguarding concerns to ULSU's Safeguarding Officers; committee members to complete ULSU's safeguarding and data protection training.</w:t>
             </w:r>
           </w:p>
         </w:tc>
@@ -7666,20 +7693,7 @@
               <w:rPr>
                 <w:sz w:val="17"/>
               </w:rPr>
-              <w:t xml:space="preserve">Commission an </w:t>
-            </w:r>
-            <w:r>
-              <w:rPr>
-                <w:b/>
-                <w:sz w:val="17"/>
-              </w:rPr>
-              <w:t>independent accessibility audit</w:t>
-            </w:r>
-            <w:r>
-              <w:rPr>
-                <w:sz w:val="17"/>
-              </w:rPr>
-              <w:t xml:space="preserve"> (WCAG 2.2 AA) and update the accessibility statement with the result.</w:t>
+              <w:t>Rehearse the breach procedure once (who to call, where the log is).</w:t>
             </w:r>
           </w:p>
         </w:tc>
@@ -7737,7 +7751,20 @@
               <w:rPr>
                 <w:sz w:val="17"/>
               </w:rPr>
-              <w:t>Read the ULSU documents only skimmed in this review (section 2) and tell us if anything conflicts.</w:t>
+              <w:t xml:space="preserve">Commission an </w:t>
+            </w:r>
+            <w:r>
+              <w:rPr>
+                <w:b/>
+                <w:sz w:val="17"/>
+              </w:rPr>
+              <w:t>independent accessibility audit</w:t>
+            </w:r>
+            <w:r>
+              <w:rPr>
+                <w:sz w:val="17"/>
+              </w:rPr>
+              <w:t xml:space="preserve"> (WCAG 2.2 AA) and update the accessibility statement with the result.</w:t>
             </w:r>
           </w:p>
         </w:tc>
@@ -7795,20 +7822,7 @@
               <w:rPr>
                 <w:sz w:val="17"/>
               </w:rPr>
-              <w:t xml:space="preserve">Confirm winners' </w:t>
-            </w:r>
-            <w:r>
-              <w:rPr>
-                <w:b/>
-                <w:sz w:val="17"/>
-              </w:rPr>
-              <w:t>consent before publishing</w:t>
-            </w:r>
-            <w:r>
-              <w:rPr>
-                <w:sz w:val="17"/>
-              </w:rPr>
-              <w:t xml:space="preserve"> Member of the Month entries and committee photos; the notice says winners are shown but does not claim a recorded consent.</w:t>
+              <w:t>Read the ULSU documents only skimmed in this review (section 2) and tell us if anything conflicts.</w:t>
             </w:r>
           </w:p>
         </w:tc>
@@ -7852,6 +7866,77 @@
               <w:rPr>
                 <w:sz w:val="17"/>
               </w:rPr>
+              <w:t>Medium</w:t>
+            </w:r>
+          </w:p>
+        </w:tc>
+        <w:tc>
+          <w:tcPr>
+            <w:tcW w:type="dxa" w:w="2493"/>
+          </w:tcPr>
+          <w:p>
+            <w:r/>
+            <w:r>
+              <w:rPr>
+                <w:sz w:val="17"/>
+              </w:rPr>
+              <w:t xml:space="preserve">Confirm winners' </w:t>
+            </w:r>
+            <w:r>
+              <w:rPr>
+                <w:b/>
+                <w:sz w:val="17"/>
+              </w:rPr>
+              <w:t>consent before publishing</w:t>
+            </w:r>
+            <w:r>
+              <w:rPr>
+                <w:sz w:val="17"/>
+              </w:rPr>
+              <w:t xml:space="preserve"> Member of the Month entries and committee photos; the notice says winners are shown but does not claim a recorded consent.</w:t>
+            </w:r>
+          </w:p>
+        </w:tc>
+        <w:tc>
+          <w:tcPr>
+            <w:tcW w:type="dxa" w:w="2493"/>
+          </w:tcPr>
+          <w:p>
+            <w:r/>
+            <w:r>
+              <w:rPr>
+                <w:sz w:val="17"/>
+              </w:rPr>
+              <w:t>Committee</w:t>
+            </w:r>
+          </w:p>
+        </w:tc>
+      </w:tr>
+      <w:tr>
+        <w:tc>
+          <w:tcPr>
+            <w:tcW w:type="dxa" w:w="2493"/>
+          </w:tcPr>
+          <w:p>
+            <w:r/>
+            <w:r>
+              <w:rPr>
+                <w:sz w:val="17"/>
+              </w:rPr>
+              <w:t>10.13</w:t>
+            </w:r>
+          </w:p>
+        </w:tc>
+        <w:tc>
+          <w:tcPr>
+            <w:tcW w:type="dxa" w:w="2493"/>
+          </w:tcPr>
+          <w:p>
+            <w:r/>
+            <w:r>
+              <w:rPr>
+                <w:sz w:val="17"/>
+              </w:rPr>
               <w:t>Low</w:t>
             </w:r>
           </w:p>
@@ -7935,7 +8020,7 @@
               <w:rPr>
                 <w:sz w:val="17"/>
               </w:rPr>
-              <w:t>10.13</w:t>
+              <w:t>10.14</w:t>
             </w:r>
           </w:p>
         </w:tc>

</xml_diff>

<commit_message>
Reword ULSU references as reference/optional (no contact made yet); remove privacy notice Children section; update report
Co-Authored-By: Claude Sonnet 5.5 <noreply@anthropic.com>
</commit_message>
<xml_diff>
--- a/LACMS-Compliance-Report.docx
+++ b/LACMS-Compliance-Report.docx
@@ -71,6 +71,35 @@
       </w:r>
       <w:r>
         <w:t xml:space="preserve"> A record of what was checked on the LACMS website, what was changed so that it meets the law and ULSU's rules, and what still has to be done by people (a website can't do everything). It is written so that it can be shown to ULSU.</w:t>
+      </w:r>
+    </w:p>
+    <w:p>
+      <w:r>
+        <w:rPr>
+          <w:b/>
+        </w:rPr>
+        <w:t>Where things stand with ULSU.</w:t>
+      </w:r>
+      <w:r>
+        <w:t xml:space="preserve"> The society has </w:t>
+      </w:r>
+      <w:r>
+        <w:rPr>
+          <w:b/>
+        </w:rPr>
+        <w:t>not yet been in contact with ULSU</w:t>
+      </w:r>
+      <w:r>
+        <w:t xml:space="preserve"> about any of this. ULSU's published policies are used throughout as a </w:t>
+      </w:r>
+      <w:r>
+        <w:rPr>
+          <w:b/>
+        </w:rPr>
+        <w:t>benchmark and reference</w:t>
+      </w:r>
+      <w:r>
+        <w:t>, not because any agreement, approval or arrangement exists. Nothing on the website or in this report should be read as saying ULSU has approved, reviewed or is overseeing it. The website describes ULSU's contacts and policies as options available to members and to the committee. Section 10.1 is the first step: open the conversation.</w:t>
       </w:r>
     </w:p>
     <w:p>
@@ -1414,7 +1443,18 @@
         <w:pStyle w:val="Heading1"/>
       </w:pPr>
       <w:r>
-        <w:t>2. Lincoln Students' Union requirements and how each is met</w:t>
+        <w:t>2. Lincoln Students' Union's published requirements and how the website lines up with them</w:t>
+      </w:r>
+    </w:p>
+    <w:p>
+      <w:r>
+        <w:t xml:space="preserve">This is a comparison against ULSU's published documents. </w:t>
+      </w:r>
+      <w:r>
+        <w:rPr>
+          <w:b/>
+        </w:rPr>
+        <w:t>No agreement or contact with ULSU has taken place yet.</w:t>
       </w:r>
     </w:p>
     <w:tbl>
@@ -1465,7 +1505,7 @@
                 <w:b/>
                 <w:sz w:val="18"/>
               </w:rPr>
-              <w:t>What it requires (as read)</w:t>
+              <w:t>What it says (as read)</w:t>
             </w:r>
           </w:p>
         </w:tc>
@@ -1485,7 +1525,7 @@
                 <w:b/>
                 <w:sz w:val="18"/>
               </w:rPr>
-              <w:t>How the website meets it</w:t>
+              <w:t>How the website lines up</w:t>
             </w:r>
           </w:p>
         </w:tc>
@@ -2529,7 +2569,7 @@
               <w:rPr>
                 <w:sz w:val="17"/>
               </w:rPr>
-              <w:t>Procedure in section 8.3; ULSU DPO to be told</w:t>
+              <w:t>Procedure in section 8.3; telling ULSU's DPO is recommended but not yet agreed</w:t>
             </w:r>
           </w:p>
         </w:tc>
@@ -2550,7 +2590,7 @@
               <w:rPr>
                 <w:sz w:val="17"/>
               </w:rPr>
-              <w:t xml:space="preserve"> to rehearse (10.9)</w:t>
+              <w:t xml:space="preserve"> to rehearse (10.9); telling ULSU's DPO is recommended but not yet agreed</w:t>
             </w:r>
           </w:p>
         </w:tc>
@@ -2659,7 +2699,7 @@
               <w:rPr>
                 <w:sz w:val="17"/>
               </w:rPr>
-              <w:t>The site is for adults; the notice says we don't knowingly collect children's data and will remove it if found</w:t>
+              <w:t>The site is for adults and does not set out to collect children's data; the privacy notice has no separate children's section (at the committee's request), so this is a small residual gap</w:t>
             </w:r>
           </w:p>
         </w:tc>
@@ -2673,7 +2713,7 @@
               <w:rPr>
                 <w:sz w:val="17"/>
               </w:rPr>
-              <w:t>Done</w:t>
+              <w:t>Done / review</w:t>
             </w:r>
           </w:p>
         </w:tc>
@@ -6311,7 +6351,16 @@
         <w:t>Copy of data:</w:t>
       </w:r>
       <w:r>
-        <w:t xml:space="preserve"> press *Download their data*, send the file securely to the verified address, delete your copy, mark Completed.</w:t>
+        <w:t xml:space="preserve"> press </w:t>
+      </w:r>
+      <w:r>
+        <w:rPr>
+          <w:i/>
+        </w:rPr>
+        <w:t>Download their data</w:t>
+      </w:r>
+      <w:r>
+        <w:t>, send the file securely to the verified address, delete your copy, mark Completed.</w:t>
       </w:r>
     </w:p>
     <w:p>
@@ -6339,7 +6388,16 @@
         <w:t>Deletion:</w:t>
       </w:r>
       <w:r>
-        <w:t xml:space="preserve"> press *Erase their data* (type ERASE). Read the "still to check" list (public winners wall, uploaded files, retained chat reports) and deal with each. Mark Completed. Explain anything kept and why.</w:t>
+        <w:t xml:space="preserve"> press </w:t>
+      </w:r>
+      <w:r>
+        <w:rPr>
+          <w:i/>
+        </w:rPr>
+        <w:t>Erase their data</w:t>
+      </w:r>
+      <w:r>
+        <w:t xml:space="preserve"> (type ERASE). Read the "still to check" list (public winners wall, uploaded files, retained chat reports) and deal with each. Mark Completed. Explain anything kept and why.</w:t>
       </w:r>
     </w:p>
     <w:p>
@@ -6416,6 +6474,14 @@
     </w:p>
     <w:p>
       <w:r>
+        <w:rPr>
+          <w:i/>
+        </w:rPr>
+        <w:t>Recommended procedure, based on ULSU's published policy. It has not yet been discussed or agreed with ULSU.</w:t>
+      </w:r>
+    </w:p>
+    <w:p>
+      <w:r>
         <w:t xml:space="preserve">Do not investigate. Listen, do not promise confidentiality, record date/time/what was said, and </w:t>
       </w:r>
       <w:r>
@@ -6449,7 +6515,7 @@
         <w:pStyle w:val="ListNumber"/>
       </w:pPr>
       <w:r>
-        <w:t>Tell ULSU's DPO (</w:t>
+        <w:t>Consider telling ULSU's DPO (</w:t>
       </w:r>
       <w:r>
         <w:rPr>
@@ -6459,16 +6525,7 @@
         <w:t>compliance@lincolnsu.com</w:t>
       </w:r>
       <w:r>
-        <w:t xml:space="preserve">) </w:t>
-      </w:r>
-      <w:r>
-        <w:rPr>
-          <w:b/>
-        </w:rPr>
-        <w:t>immediately</w:t>
-      </w:r>
-      <w:r>
-        <w:t>.</w:t>
+        <w:t>) straight away. This is recommended, not yet agreed with ULSU.</w:t>
       </w:r>
     </w:p>
     <w:p>
@@ -7045,9 +7102,16 @@
             <w:r/>
             <w:r>
               <w:rPr>
-                <w:sz w:val="17"/>
-              </w:rPr>
-              <w:t xml:space="preserve">Get ULSU's </w:t>
+                <w:b/>
+                <w:sz w:val="17"/>
+              </w:rPr>
+              <w:t>Make first contact with ULSU</w:t>
+            </w:r>
+            <w:r>
+              <w:rPr>
+                <w:sz w:val="17"/>
+              </w:rPr>
+              <w:t xml:space="preserve"> (none has happened yet) and get </w:t>
             </w:r>
             <w:r>
               <w:rPr>
@@ -7419,7 +7483,20 @@
               <w:rPr>
                 <w:sz w:val="17"/>
               </w:rPr>
-              <w:t xml:space="preserve"> extension in Supabase, then run migration 110 again (it then schedules the nightly clean-up), or press *Run clean-up now* monthly. Review inactive accounts annually.</w:t>
+              <w:t xml:space="preserve"> extension in Supabase, then run migration 110 again (it then schedules the nightly clean-up), or press </w:t>
+            </w:r>
+            <w:r>
+              <w:rPr>
+                <w:i/>
+                <w:sz w:val="17"/>
+              </w:rPr>
+              <w:t>Run clean-up now</w:t>
+            </w:r>
+            <w:r>
+              <w:rPr>
+                <w:sz w:val="17"/>
+              </w:rPr>
+              <w:t xml:space="preserve"> monthly. Review inactive accounts annually.</w:t>
             </w:r>
           </w:p>
         </w:tc>

</xml_diff>

<commit_message>
Privacy notice: describe Network visibility accurately; add Network directory action to compliance report
Co-Authored-By: Claude Sonnet 5.5 <noreply@anthropic.com>
</commit_message>
<xml_diff>
--- a/LACMS-Compliance-Report.docx
+++ b/LACMS-Compliance-Report.docx
@@ -8140,6 +8140,72 @@
                 <w:sz w:val="17"/>
               </w:rPr>
               <w:t>Site administrator</w:t>
+            </w:r>
+          </w:p>
+        </w:tc>
+      </w:tr>
+      <w:tr>
+        <w:tc>
+          <w:tcPr>
+            <w:tcW w:type="dxa" w:w="2493"/>
+          </w:tcPr>
+          <w:p>
+            <w:r/>
+            <w:r>
+              <w:rPr>
+                <w:sz w:val="17"/>
+              </w:rPr>
+              <w:t>10.15</w:t>
+            </w:r>
+          </w:p>
+        </w:tc>
+        <w:tc>
+          <w:tcPr>
+            <w:tcW w:type="dxa" w:w="2493"/>
+          </w:tcPr>
+          <w:p>
+            <w:r/>
+            <w:r>
+              <w:rPr>
+                <w:b/>
+                <w:sz w:val="17"/>
+              </w:rPr>
+              <w:t>High</w:t>
+            </w:r>
+          </w:p>
+        </w:tc>
+        <w:tc>
+          <w:tcPr>
+            <w:tcW w:type="dxa" w:w="2493"/>
+          </w:tcPr>
+          <w:p>
+            <w:r/>
+            <w:r>
+              <w:rPr>
+                <w:b/>
+                <w:sz w:val="17"/>
+              </w:rPr>
+              <w:t>The Network directory:</w:t>
+            </w:r>
+            <w:r>
+              <w:rPr>
+                <w:sz w:val="17"/>
+              </w:rPr>
+              <w:t xml:space="preserve"> every active member is listed (name, course, year, plus any LinkedIn/bio they add) to everyone given Network access, which can include approved external healthcare professionals. Members cannot currently hide themselves (only the committee can). The Network is closed by default and opened by the committee in Hub Access. Before opening it, decide whether it should be opt-in or have a self-service "hide me", and ask ULSU whether it is happy with membership details being used this way.</w:t>
+            </w:r>
+          </w:p>
+        </w:tc>
+        <w:tc>
+          <w:tcPr>
+            <w:tcW w:type="dxa" w:w="2493"/>
+          </w:tcPr>
+          <w:p>
+            <w:r/>
+            <w:r>
+              <w:rPr>
+                <w:sz w:val="17"/>
+              </w:rPr>
+              <w:t>Committee, with ULSU</w:t>
             </w:r>
           </w:p>
         </w:tc>

</xml_diff>

<commit_message>
ULSU alignment pass: committee data protection confirmation (migration 111), external-speaker warnings, incident link, not-official-SU-site footer line, rule-by-rule ULSU comparison in the report
Co-Authored-By: Claude Sonnet 5.5 <noreply@anthropic.com>
</commit_message>
<xml_diff>
--- a/LACMS-Compliance-Report.docx
+++ b/LACMS-Compliance-Report.docx
@@ -161,7 +161,7 @@
         <w:pStyle w:val="ListNumber"/>
       </w:pPr>
       <w:r>
-        <w:t>ULSU's published policies were fetched and read: the Privacy Notice (August 2026), the Safeguarding of Children and Vulnerable Adults Policy, the Student Members' Social Media Policy, and the Group Gmail Access and Onboarding Policy. Their titles only were seen for the Code of Conduct, Equal Opportunities Policy, Complaints Handbook, Terms and Conditions, Cookie Policy and the University/ULSU Data Sharing Agreement; these should be read by the committee (see section 2).</w:t>
+        <w:t>ULSU's published policies were fetched and read: the Privacy Notice (August 2026), the Safeguarding of Children and Vulnerable Adults Policy, the Student Members' Social Media Policy, and the Group Gmail Access and Onboarding Policy. The wider set read for the second pass, and the few not read, are listed in section 2.</w:t>
       </w:r>
     </w:p>
     <w:p>
@@ -1436,6 +1436,85 @@
           </w:p>
         </w:tc>
       </w:tr>
+      <w:tr>
+        <w:tc>
+          <w:tcPr>
+            <w:tcW w:type="dxa" w:w="1994"/>
+          </w:tcPr>
+          <w:p>
+            <w:r/>
+            <w:r>
+              <w:rPr>
+                <w:sz w:val="17"/>
+              </w:rPr>
+              <w:t>16</w:t>
+            </w:r>
+          </w:p>
+        </w:tc>
+        <w:tc>
+          <w:tcPr>
+            <w:tcW w:type="dxa" w:w="1994"/>
+          </w:tcPr>
+          <w:p>
+            <w:r/>
+            <w:r>
+              <w:rPr>
+                <w:sz w:val="17"/>
+              </w:rPr>
+              <w:t>ULSU's own rules (Code of Conduct, External Speakers, Non-Student Membership, Social Media, Gmail, Safeguarding and others)</w:t>
+            </w:r>
+          </w:p>
+        </w:tc>
+        <w:tc>
+          <w:tcPr>
+            <w:tcW w:type="dxa" w:w="1994"/>
+          </w:tcPr>
+          <w:p>
+            <w:r/>
+            <w:r>
+              <w:rPr>
+                <w:sz w:val="17"/>
+              </w:rPr>
+              <w:t>Not compared</w:t>
+            </w:r>
+          </w:p>
+        </w:tc>
+        <w:tc>
+          <w:tcPr>
+            <w:tcW w:type="dxa" w:w="1994"/>
+          </w:tcPr>
+          <w:p>
+            <w:r/>
+            <w:r>
+              <w:rPr>
+                <w:sz w:val="17"/>
+              </w:rPr>
+              <w:t>Compared rule by rule in section 2; committee data-protection confirmation, speaker and brand safeguards built; five items need the committee or ULSU</w:t>
+            </w:r>
+          </w:p>
+        </w:tc>
+        <w:tc>
+          <w:tcPr>
+            <w:tcW w:type="dxa" w:w="1994"/>
+          </w:tcPr>
+          <w:p>
+            <w:r/>
+            <w:r>
+              <w:rPr>
+                <w:b/>
+                <w:sz w:val="17"/>
+              </w:rPr>
+              <w:t>Action needed</w:t>
+            </w:r>
+            <w:r>
+              <w:rPr>
+                <w:sz w:val="17"/>
+              </w:rPr>
+              <w:t xml:space="preserve"> (10.15 to 10.18)</w:t>
+            </w:r>
+          </w:p>
+        </w:tc>
+      </w:tr>
     </w:tbl>
     <w:p/>
     <w:p>
@@ -1443,18 +1522,21 @@
         <w:pStyle w:val="Heading1"/>
       </w:pPr>
       <w:r>
-        <w:t>2. Lincoln Students' Union's published requirements and how the website lines up with them</w:t>
+        <w:t>2. Lincoln Students' Union's published rules and how the website lines up</w:t>
       </w:r>
     </w:p>
     <w:p>
       <w:r>
-        <w:t xml:space="preserve">This is a comparison against ULSU's published documents. </w:t>
+        <w:t xml:space="preserve">This compares the website against ULSU's published documents (listed in Appendix C). </w:t>
       </w:r>
       <w:r>
         <w:rPr>
           <w:b/>
         </w:rPr>
-        <w:t>No agreement or contact with ULSU has taken place yet.</w:t>
+        <w:t>No agreement or contact with ULSU has taken place yet</w:t>
+      </w:r>
+      <w:r>
+        <w:t>, so "lines up" means "is consistent with what ULSU has published", not "ULSU has approved it". Documents read in full: Privacy Notice, Code of Conduct 2026/27, Safeguarding Policy, Student Members' Social Media Policy, Group Gmail Policy, Non-Student Membership Policy, External Speakers Policy, Political Activity Policy, Equal Opportunities Policy (membership parts), Complaints Handbook (data protection and societies parts), the University/ULSU Information Sharing Agreement, the Brand Guidelines, and the Student Code of Practice. ULSU's Terms, Cookie Policy and accessibility page were checked only for rules about societies (none found). The Fundraising, Conflict of Interest, Foreign Influence, Campaigning, Trips &amp; Events and Volunteering policies were not read in detail because they concern activities, not the website.</w:t>
       </w:r>
     </w:p>
     <w:tbl>
@@ -1464,14 +1546,16 @@
         <w:tblLook w:firstColumn="1" w:firstRow="1" w:lastColumn="0" w:lastRow="0" w:noHBand="0" w:noVBand="1" w:val="04A0"/>
       </w:tblPr>
       <w:tblGrid>
-        <w:gridCol w:w="3324"/>
-        <w:gridCol w:w="3324"/>
-        <w:gridCol w:w="3324"/>
+        <w:gridCol w:w="1994"/>
+        <w:gridCol w:w="1994"/>
+        <w:gridCol w:w="1994"/>
+        <w:gridCol w:w="1994"/>
+        <w:gridCol w:w="1994"/>
       </w:tblGrid>
       <w:tr>
         <w:tc>
           <w:tcPr>
-            <w:tcW w:type="dxa" w:w="3324"/>
+            <w:tcW w:type="dxa" w:w="1994"/>
             <w:shd w:val="clear" w:color="auto" w:fill="E8E1CC"/>
           </w:tcPr>
           <w:p>
@@ -1485,13 +1569,13 @@
                 <w:b/>
                 <w:sz w:val="18"/>
               </w:rPr>
-              <w:t>ULSU document</w:t>
-            </w:r>
-          </w:p>
-        </w:tc>
-        <w:tc>
-          <w:tcPr>
-            <w:tcW w:type="dxa" w:w="3324"/>
+              <w:t>#</w:t>
+            </w:r>
+          </w:p>
+        </w:tc>
+        <w:tc>
+          <w:tcPr>
+            <w:tcW w:type="dxa" w:w="1994"/>
             <w:shd w:val="clear" w:color="auto" w:fill="E8E1CC"/>
           </w:tcPr>
           <w:p>
@@ -1505,13 +1589,13 @@
                 <w:b/>
                 <w:sz w:val="18"/>
               </w:rPr>
-              <w:t>What it says (as read)</w:t>
-            </w:r>
-          </w:p>
-        </w:tc>
-        <w:tc>
-          <w:tcPr>
-            <w:tcW w:type="dxa" w:w="3324"/>
+              <w:t>ULSU rule</w:t>
+            </w:r>
+          </w:p>
+        </w:tc>
+        <w:tc>
+          <w:tcPr>
+            <w:tcW w:type="dxa" w:w="1994"/>
             <w:shd w:val="clear" w:color="auto" w:fill="E8E1CC"/>
           </w:tcPr>
           <w:p>
@@ -1525,7 +1609,47 @@
                 <w:b/>
                 <w:sz w:val="18"/>
               </w:rPr>
-              <w:t>How the website lines up</w:t>
+              <w:t>Where it comes from</w:t>
+            </w:r>
+          </w:p>
+        </w:tc>
+        <w:tc>
+          <w:tcPr>
+            <w:tcW w:type="dxa" w:w="1994"/>
+            <w:shd w:val="clear" w:color="auto" w:fill="E8E1CC"/>
+          </w:tcPr>
+          <w:p>
+            <w:r>
+              <w:rPr>
+                <w:b/>
+              </w:rPr>
+            </w:r>
+            <w:r>
+              <w:rPr>
+                <w:b/>
+                <w:sz w:val="18"/>
+              </w:rPr>
+              <w:t>Website position</w:t>
+            </w:r>
+          </w:p>
+        </w:tc>
+        <w:tc>
+          <w:tcPr>
+            <w:tcW w:type="dxa" w:w="1994"/>
+            <w:shd w:val="clear" w:color="auto" w:fill="E8E1CC"/>
+          </w:tcPr>
+          <w:p>
+            <w:r>
+              <w:rPr>
+                <w:b/>
+              </w:rPr>
+            </w:r>
+            <w:r>
+              <w:rPr>
+                <w:b/>
+                <w:sz w:val="18"/>
+              </w:rPr>
+              <w:t>Status</w:t>
             </w:r>
           </w:p>
         </w:tc>
@@ -1533,89 +1657,1051 @@
       <w:tr>
         <w:tc>
           <w:tcPr>
-            <w:tcW w:type="dxa" w:w="3324"/>
-          </w:tcPr>
-          <w:p>
-            <w:r/>
+            <w:tcW w:type="dxa" w:w="1994"/>
+          </w:tcPr>
+          <w:p>
+            <w:r/>
+            <w:r>
+              <w:rPr>
+                <w:sz w:val="17"/>
+              </w:rPr>
+              <w:t>1</w:t>
+            </w:r>
+          </w:p>
+        </w:tc>
+        <w:tc>
+          <w:tcPr>
+            <w:tcW w:type="dxa" w:w="1994"/>
+          </w:tcPr>
+          <w:p>
+            <w:r/>
+            <w:r>
+              <w:rPr>
+                <w:sz w:val="17"/>
+              </w:rPr>
+              <w:t xml:space="preserve">Committee members complete ULSU's </w:t>
+            </w:r>
             <w:r>
               <w:rPr>
                 <w:b/>
                 <w:sz w:val="17"/>
               </w:rPr>
-              <w:t>Privacy Notice (08/26)</w:t>
-            </w:r>
-            <w:r>
-              <w:rPr>
-                <w:sz w:val="17"/>
-              </w:rPr>
-              <w:t xml:space="preserve">: ULSU is data controller for SU activity; DPO is </w:t>
+              <w:t>data protection training before being given access to personal data</w:t>
+            </w:r>
+          </w:p>
+        </w:tc>
+        <w:tc>
+          <w:tcPr>
+            <w:tcW w:type="dxa" w:w="1994"/>
+          </w:tcPr>
+          <w:p>
+            <w:r/>
+            <w:r>
+              <w:rPr>
+                <w:sz w:val="17"/>
+              </w:rPr>
+              <w:t>Code of Conduct, "Data Protection"</w:t>
+            </w:r>
+          </w:p>
+        </w:tc>
+        <w:tc>
+          <w:tcPr>
+            <w:tcW w:type="dxa" w:w="1994"/>
+          </w:tcPr>
+          <w:p>
+            <w:r/>
+            <w:r>
+              <w:rPr>
+                <w:sz w:val="17"/>
+              </w:rPr>
+              <w:t>Each committee member who opens the dashboard is asked once a year to confirm whether they have completed the training; the answer is recorded (and the president can see it); "not yet" shows a reminder until confirmed. The website cannot deliver or verify the training. It records and reminds rather than blocking access.</w:t>
+            </w:r>
+          </w:p>
+        </w:tc>
+        <w:tc>
+          <w:tcPr>
+            <w:tcW w:type="dxa" w:w="1994"/>
+          </w:tcPr>
+          <w:p>
+            <w:r/>
+            <w:r>
+              <w:rPr>
+                <w:b/>
+                <w:sz w:val="17"/>
+              </w:rPr>
+              <w:t>Partly met. Action needed</w:t>
+            </w:r>
+            <w:r>
+              <w:rPr>
+                <w:sz w:val="17"/>
+              </w:rPr>
+              <w:t xml:space="preserve"> (10.16)</w:t>
+            </w:r>
+          </w:p>
+        </w:tc>
+      </w:tr>
+      <w:tr>
+        <w:tc>
+          <w:tcPr>
+            <w:tcW w:type="dxa" w:w="1994"/>
+          </w:tcPr>
+          <w:p>
+            <w:r/>
+            <w:r>
+              <w:rPr>
+                <w:sz w:val="17"/>
+              </w:rPr>
+              <w:t>2</w:t>
+            </w:r>
+          </w:p>
+        </w:tc>
+        <w:tc>
+          <w:tcPr>
+            <w:tcW w:type="dxa" w:w="1994"/>
+          </w:tcPr>
+          <w:p>
+            <w:r/>
+            <w:r>
+              <w:rPr>
+                <w:b/>
+                <w:sz w:val="17"/>
+              </w:rPr>
+              <w:t>External speakers</w:t>
+            </w:r>
+            <w:r>
+              <w:rPr>
+                <w:sz w:val="17"/>
+              </w:rPr>
+              <w:t xml:space="preserve"> (anyone who isn't a current student or staff member, including professionals) must be cleared by ULSU through the Student Dashboard, 10 working days ahead, and </w:t>
+            </w:r>
+            <w:r>
+              <w:rPr>
+                <w:b/>
+                <w:sz w:val="17"/>
+              </w:rPr>
+              <w:t>the event must not be publicised until cleared</w:t>
+            </w:r>
+          </w:p>
+        </w:tc>
+        <w:tc>
+          <w:tcPr>
+            <w:tcW w:type="dxa" w:w="1994"/>
+          </w:tcPr>
+          <w:p>
+            <w:r/>
+            <w:r>
+              <w:rPr>
+                <w:sz w:val="17"/>
+              </w:rPr>
+              <w:t>External Speakers Policy; Code of Conduct</w:t>
+            </w:r>
+          </w:p>
+        </w:tc>
+        <w:tc>
+          <w:tcPr>
+            <w:tcW w:type="dxa" w:w="1994"/>
+          </w:tcPr>
+          <w:p>
+            <w:r/>
+            <w:r>
+              <w:rPr>
+                <w:sz w:val="17"/>
+              </w:rPr>
+              <w:t>The event editor now warns committee members before publishing; the professional request form says offering to speak isn't an invitation. Whether any existing event has an uncleared external speaker can't be checked from the code.</w:t>
+            </w:r>
+          </w:p>
+        </w:tc>
+        <w:tc>
+          <w:tcPr>
+            <w:tcW w:type="dxa" w:w="1994"/>
+          </w:tcPr>
+          <w:p>
+            <w:r/>
+            <w:r>
+              <w:rPr>
+                <w:b/>
+                <w:sz w:val="17"/>
+              </w:rPr>
+              <w:t>Partly met. Action needed</w:t>
+            </w:r>
+            <w:r>
+              <w:rPr>
+                <w:sz w:val="17"/>
+              </w:rPr>
+              <w:t xml:space="preserve"> (10.17)</w:t>
+            </w:r>
+          </w:p>
+        </w:tc>
+      </w:tr>
+      <w:tr>
+        <w:tc>
+          <w:tcPr>
+            <w:tcW w:type="dxa" w:w="1994"/>
+          </w:tcPr>
+          <w:p>
+            <w:r/>
+            <w:r>
+              <w:rPr>
+                <w:sz w:val="17"/>
+              </w:rPr>
+              <w:t>3</w:t>
+            </w:r>
+          </w:p>
+        </w:tc>
+        <w:tc>
+          <w:tcPr>
+            <w:tcW w:type="dxa" w:w="1994"/>
+          </w:tcPr>
+          <w:p>
+            <w:r/>
+            <w:r>
+              <w:rPr>
+                <w:b/>
+                <w:sz w:val="17"/>
+              </w:rPr>
+              <w:t>Non-students</w:t>
+            </w:r>
+            <w:r>
+              <w:rPr>
+                <w:sz w:val="17"/>
+              </w:rPr>
+              <w:t xml:space="preserve"> can take part in society activity only through a ULSU Non-Student Membership (Associate, Visiting, Coaches...), and cannot hold society committee roles</w:t>
+            </w:r>
+          </w:p>
+        </w:tc>
+        <w:tc>
+          <w:tcPr>
+            <w:tcW w:type="dxa" w:w="1994"/>
+          </w:tcPr>
+          <w:p>
+            <w:r/>
+            <w:r>
+              <w:rPr>
+                <w:sz w:val="17"/>
+              </w:rPr>
+              <w:t>Non-Student Membership Policy</w:t>
+            </w:r>
+          </w:p>
+        </w:tc>
+        <w:tc>
+          <w:tcPr>
+            <w:tcW w:type="dxa" w:w="1994"/>
+          </w:tcPr>
+          <w:p>
+            <w:r/>
+            <w:r>
+              <w:rPr>
+                <w:sz w:val="17"/>
+              </w:rPr>
+              <w:t xml:space="preserve">The site lets approved healthcare professionals (not students) into the Network, the Sankofa Hub and messaging. None holds a committee role. ULSU may say these people need a membership type, or that they take part as invited guests/speakers. This is a </w:t>
+            </w:r>
+            <w:r>
+              <w:rPr>
+                <w:b/>
+                <w:sz w:val="17"/>
+              </w:rPr>
+              <w:t>ULSU decision</w:t>
+            </w:r>
+            <w:r>
+              <w:rPr>
+                <w:sz w:val="17"/>
+              </w:rPr>
+              <w:t>, not something code can settle.</w:t>
+            </w:r>
+          </w:p>
+        </w:tc>
+        <w:tc>
+          <w:tcPr>
+            <w:tcW w:type="dxa" w:w="1994"/>
+          </w:tcPr>
+          <w:p>
+            <w:r/>
+            <w:r>
+              <w:rPr>
+                <w:b/>
+                <w:sz w:val="17"/>
+              </w:rPr>
+              <w:t>Not confirmed. Action needed</w:t>
+            </w:r>
+            <w:r>
+              <w:rPr>
+                <w:sz w:val="17"/>
+              </w:rPr>
+              <w:t xml:space="preserve"> (10.15)</w:t>
+            </w:r>
+          </w:p>
+        </w:tc>
+      </w:tr>
+      <w:tr>
+        <w:tc>
+          <w:tcPr>
+            <w:tcW w:type="dxa" w:w="1994"/>
+          </w:tcPr>
+          <w:p>
+            <w:r/>
+            <w:r>
+              <w:rPr>
+                <w:sz w:val="17"/>
+              </w:rPr>
+              <w:t>4</w:t>
+            </w:r>
+          </w:p>
+        </w:tc>
+        <w:tc>
+          <w:tcPr>
+            <w:tcW w:type="dxa" w:w="1994"/>
+          </w:tcPr>
+          <w:p>
+            <w:r/>
+            <w:r>
+              <w:rPr>
+                <w:sz w:val="17"/>
+              </w:rPr>
+              <w:t xml:space="preserve">Only </w:t>
+            </w:r>
+            <w:r>
+              <w:rPr>
+                <w:b/>
+                <w:sz w:val="17"/>
+              </w:rPr>
+              <w:t>current members</w:t>
+            </w:r>
+            <w:r>
+              <w:rPr>
+                <w:sz w:val="17"/>
+              </w:rPr>
+              <w:t xml:space="preserve"> may attend society events; societies report anyone without valid membership</w:t>
+            </w:r>
+          </w:p>
+        </w:tc>
+        <w:tc>
+          <w:tcPr>
+            <w:tcW w:type="dxa" w:w="1994"/>
+          </w:tcPr>
+          <w:p>
+            <w:r/>
+            <w:r>
+              <w:rPr>
+                <w:sz w:val="17"/>
+              </w:rPr>
+              <w:t>Social Media Policy; Code of Conduct</w:t>
+            </w:r>
+          </w:p>
+        </w:tc>
+        <w:tc>
+          <w:tcPr>
+            <w:tcW w:type="dxa" w:w="1994"/>
+          </w:tcPr>
+          <w:p>
+            <w:r/>
+            <w:r>
+              <w:rPr>
+                <w:sz w:val="17"/>
+              </w:rPr>
+              <w:t>Account approval checks the person has paid for membership through ULSU; event registration needs a members' login</w:t>
+            </w:r>
+          </w:p>
+        </w:tc>
+        <w:tc>
+          <w:tcPr>
+            <w:tcW w:type="dxa" w:w="1994"/>
+          </w:tcPr>
+          <w:p>
+            <w:r/>
+            <w:r>
+              <w:rPr>
+                <w:sz w:val="17"/>
+              </w:rPr>
+              <w:t>Met</w:t>
+            </w:r>
+          </w:p>
+        </w:tc>
+      </w:tr>
+      <w:tr>
+        <w:tc>
+          <w:tcPr>
+            <w:tcW w:type="dxa" w:w="1994"/>
+          </w:tcPr>
+          <w:p>
+            <w:r/>
+            <w:r>
+              <w:rPr>
+                <w:sz w:val="17"/>
+              </w:rPr>
+              <w:t>5</w:t>
+            </w:r>
+          </w:p>
+        </w:tc>
+        <w:tc>
+          <w:tcPr>
+            <w:tcW w:type="dxa" w:w="1994"/>
+          </w:tcPr>
+          <w:p>
+            <w:r/>
+            <w:r>
+              <w:rPr>
+                <w:b/>
+                <w:sz w:val="17"/>
+              </w:rPr>
+              <w:t>All money for activities goes through ULSU</w:t>
+            </w:r>
+            <w:r>
+              <w:rPr>
+                <w:sz w:val="17"/>
+              </w:rPr>
+              <w:t>; no outside bank accounts or collecting money; external fundraising needs Trustees' permission</w:t>
+            </w:r>
+          </w:p>
+        </w:tc>
+        <w:tc>
+          <w:tcPr>
+            <w:tcW w:type="dxa" w:w="1994"/>
+          </w:tcPr>
+          <w:p>
+            <w:r/>
+            <w:r>
+              <w:rPr>
+                <w:sz w:val="17"/>
+              </w:rPr>
+              <w:t>Code of Conduct; External Speakers Policy</w:t>
+            </w:r>
+          </w:p>
+        </w:tc>
+        <w:tc>
+          <w:tcPr>
+            <w:tcW w:type="dxa" w:w="1994"/>
+          </w:tcPr>
+          <w:p>
+            <w:r/>
+            <w:r>
+              <w:rPr>
+                <w:sz w:val="17"/>
+              </w:rPr>
+              <w:t xml:space="preserve">The website handles no money (membership is bought on ULSU's site). The events page lists a </w:t>
+            </w:r>
+            <w:r>
+              <w:rPr>
+                <w:i/>
+                <w:sz w:val="17"/>
+              </w:rPr>
+              <w:t>Winter Charity Fundraiser</w:t>
+            </w:r>
+            <w:r>
+              <w:rPr>
+                <w:sz w:val="17"/>
+              </w:rPr>
+              <w:t>: any collecting must run through ULSU and may need Trustee permission.</w:t>
+            </w:r>
+          </w:p>
+        </w:tc>
+        <w:tc>
+          <w:tcPr>
+            <w:tcW w:type="dxa" w:w="1994"/>
+          </w:tcPr>
+          <w:p>
+            <w:r/>
+            <w:r>
+              <w:rPr>
+                <w:sz w:val="17"/>
+              </w:rPr>
+              <w:t xml:space="preserve">Met for the site; </w:t>
+            </w:r>
+            <w:r>
+              <w:rPr>
+                <w:b/>
+                <w:sz w:val="17"/>
+              </w:rPr>
+              <w:t>Action needed</w:t>
+            </w:r>
+            <w:r>
+              <w:rPr>
+                <w:sz w:val="17"/>
+              </w:rPr>
+              <w:t xml:space="preserve"> (10.18)</w:t>
+            </w:r>
+          </w:p>
+        </w:tc>
+      </w:tr>
+      <w:tr>
+        <w:tc>
+          <w:tcPr>
+            <w:tcW w:type="dxa" w:w="1994"/>
+          </w:tcPr>
+          <w:p>
+            <w:r/>
+            <w:r>
+              <w:rPr>
+                <w:sz w:val="17"/>
+              </w:rPr>
+              <w:t>6</w:t>
+            </w:r>
+          </w:p>
+        </w:tc>
+        <w:tc>
+          <w:tcPr>
+            <w:tcW w:type="dxa" w:w="1994"/>
+          </w:tcPr>
+          <w:p>
+            <w:r/>
+            <w:r>
+              <w:rPr>
+                <w:sz w:val="17"/>
+              </w:rPr>
+              <w:t>Data: ULSU is controller for SU activity; rights, one-month replies, complaints handled by the DPO then the ICO; marketing consent or soft opt-in with free opt-out</w:t>
+            </w:r>
+          </w:p>
+        </w:tc>
+        <w:tc>
+          <w:tcPr>
+            <w:tcW w:type="dxa" w:w="1994"/>
+          </w:tcPr>
+          <w:p>
+            <w:r/>
+            <w:r>
+              <w:rPr>
+                <w:sz w:val="17"/>
+              </w:rPr>
+              <w:t>ULSU Privacy Notice; Complaints Handbook</w:t>
+            </w:r>
+          </w:p>
+        </w:tc>
+        <w:tc>
+          <w:tcPr>
+            <w:tcW w:type="dxa" w:w="1994"/>
+          </w:tcPr>
+          <w:p>
+            <w:r/>
+            <w:r>
+              <w:rPr>
+                <w:sz w:val="17"/>
+              </w:rPr>
+              <w:t>Notice uses the same rights and timescales, shows ULSU's DPO and complaints contacts, and has an update-email opt-out</w:t>
+            </w:r>
+          </w:p>
+        </w:tc>
+        <w:tc>
+          <w:tcPr>
+            <w:tcW w:type="dxa" w:w="1994"/>
+          </w:tcPr>
+          <w:p>
+            <w:r/>
+            <w:r>
+              <w:rPr>
+                <w:sz w:val="17"/>
+              </w:rPr>
+              <w:t>Met (wording to be agreed with ULSU, 10.1)</w:t>
+            </w:r>
+          </w:p>
+        </w:tc>
+      </w:tr>
+      <w:tr>
+        <w:tc>
+          <w:tcPr>
+            <w:tcW w:type="dxa" w:w="1994"/>
+          </w:tcPr>
+          <w:p>
+            <w:r/>
+            <w:r>
+              <w:rPr>
+                <w:sz w:val="17"/>
+              </w:rPr>
+              <w:t>7</w:t>
+            </w:r>
+          </w:p>
+        </w:tc>
+        <w:tc>
+          <w:tcPr>
+            <w:tcW w:type="dxa" w:w="1994"/>
+          </w:tcPr>
+          <w:p>
+            <w:r/>
+            <w:r>
+              <w:rPr>
+                <w:sz w:val="17"/>
+              </w:rPr>
+              <w:t xml:space="preserve">Student data from the University must not be passed to third parties without written authority, and </w:t>
+            </w:r>
+            <w:r>
+              <w:rPr>
+                <w:b/>
+                <w:sz w:val="17"/>
+              </w:rPr>
+              <w:t>not exported outside the EEA</w:t>
+            </w:r>
+            <w:r>
+              <w:rPr>
+                <w:sz w:val="17"/>
+              </w:rPr>
+              <w:t xml:space="preserve"> without adequate protection</w:t>
+            </w:r>
+          </w:p>
+        </w:tc>
+        <w:tc>
+          <w:tcPr>
+            <w:tcW w:type="dxa" w:w="1994"/>
+          </w:tcPr>
+          <w:p>
+            <w:r/>
+            <w:r>
+              <w:rPr>
+                <w:sz w:val="17"/>
+              </w:rPr>
+              <w:t>University/ULSU Information Sharing Agreement</w:t>
+            </w:r>
+          </w:p>
+        </w:tc>
+        <w:tc>
+          <w:tcPr>
+            <w:tcW w:type="dxa" w:w="1994"/>
+          </w:tcPr>
+          <w:p>
+            <w:r/>
+            <w:r>
+              <w:rPr>
+                <w:sz w:val="17"/>
+              </w:rPr>
+              <w:t>The website holds data members give it directly. It does not import the University's student data. Hosting and email providers may be outside the UK/EEA (10.3).</w:t>
+            </w:r>
+          </w:p>
+        </w:tc>
+        <w:tc>
+          <w:tcPr>
+            <w:tcW w:type="dxa" w:w="1994"/>
+          </w:tcPr>
+          <w:p>
+            <w:r/>
+            <w:r>
+              <w:rPr>
+                <w:b/>
+                <w:sz w:val="17"/>
+              </w:rPr>
+              <w:t>Check needed</w:t>
+            </w:r>
+            <w:r>
+              <w:rPr>
+                <w:sz w:val="17"/>
+              </w:rPr>
+              <w:t xml:space="preserve"> (10.3)</w:t>
+            </w:r>
+          </w:p>
+        </w:tc>
+      </w:tr>
+      <w:tr>
+        <w:tc>
+          <w:tcPr>
+            <w:tcW w:type="dxa" w:w="1994"/>
+          </w:tcPr>
+          <w:p>
+            <w:r/>
+            <w:r>
+              <w:rPr>
+                <w:sz w:val="17"/>
+              </w:rPr>
+              <w:t>8</w:t>
+            </w:r>
+          </w:p>
+        </w:tc>
+        <w:tc>
+          <w:tcPr>
+            <w:tcW w:type="dxa" w:w="1994"/>
+          </w:tcPr>
+          <w:p>
+            <w:r/>
+            <w:r>
+              <w:rPr>
+                <w:sz w:val="17"/>
+              </w:rPr>
+              <w:t>Safeguarding concerns go to the ULSU Safeguarding Officers; incidents at activities are reported through the Student Dashboard; Prevent duty</w:t>
+            </w:r>
+          </w:p>
+        </w:tc>
+        <w:tc>
+          <w:tcPr>
+            <w:tcW w:type="dxa" w:w="1994"/>
+          </w:tcPr>
+          <w:p>
+            <w:r/>
+            <w:r>
+              <w:rPr>
+                <w:sz w:val="17"/>
+              </w:rPr>
+              <w:t>Safeguarding Policy; Code of Conduct</w:t>
+            </w:r>
+          </w:p>
+        </w:tc>
+        <w:tc>
+          <w:tcPr>
+            <w:tcW w:type="dxa" w:w="1994"/>
+          </w:tcPr>
+          <w:p>
+            <w:r/>
+            <w:r>
+              <w:rPr>
+                <w:sz w:val="17"/>
+              </w:rPr>
+              <w:t>Safeguarding page names the route and the urgent-help numbers and links ULSU's incident report form</w:t>
+            </w:r>
+          </w:p>
+        </w:tc>
+        <w:tc>
+          <w:tcPr>
+            <w:tcW w:type="dxa" w:w="1994"/>
+          </w:tcPr>
+          <w:p>
+            <w:r/>
+            <w:r>
+              <w:rPr>
+                <w:sz w:val="17"/>
+              </w:rPr>
+              <w:t xml:space="preserve">Met; </w:t>
+            </w:r>
+            <w:r>
+              <w:rPr>
+                <w:b/>
+                <w:sz w:val="17"/>
+              </w:rPr>
+              <w:t>Action needed</w:t>
+            </w:r>
+            <w:r>
+              <w:rPr>
+                <w:sz w:val="17"/>
+              </w:rPr>
+              <w:t xml:space="preserve"> (10.8)</w:t>
+            </w:r>
+          </w:p>
+        </w:tc>
+      </w:tr>
+      <w:tr>
+        <w:tc>
+          <w:tcPr>
+            <w:tcW w:type="dxa" w:w="1994"/>
+          </w:tcPr>
+          <w:p>
+            <w:r/>
+            <w:r>
+              <w:rPr>
+                <w:sz w:val="17"/>
+              </w:rPr>
+              <w:t>9</w:t>
+            </w:r>
+          </w:p>
+        </w:tc>
+        <w:tc>
+          <w:tcPr>
+            <w:tcW w:type="dxa" w:w="1994"/>
+          </w:tcPr>
+          <w:p>
+            <w:r/>
+            <w:r>
+              <w:rPr>
+                <w:sz w:val="17"/>
+              </w:rPr>
+              <w:t>Professional, respectful online conduct; no harassment, explicit or defamatory content; no deceptive AI content; don't misrepresent ULSU</w:t>
+            </w:r>
+          </w:p>
+        </w:tc>
+        <w:tc>
+          <w:tcPr>
+            <w:tcW w:type="dxa" w:w="1994"/>
+          </w:tcPr>
+          <w:p>
+            <w:r/>
+            <w:r>
+              <w:rPr>
+                <w:sz w:val="17"/>
+              </w:rPr>
+              <w:t>Code of Conduct; Social Media Policy</w:t>
+            </w:r>
+          </w:p>
+        </w:tc>
+        <w:tc>
+          <w:tcPr>
+            <w:tcW w:type="dxa" w:w="1994"/>
+          </w:tcPr>
+          <w:p>
+            <w:r/>
+            <w:r>
+              <w:rPr>
+                <w:sz w:val="17"/>
+              </w:rPr>
+              <w:t>Terms of use cover each. The footer now says this is the society's own website and not an official ULSU website.</w:t>
+            </w:r>
+          </w:p>
+        </w:tc>
+        <w:tc>
+          <w:tcPr>
+            <w:tcW w:type="dxa" w:w="1994"/>
+          </w:tcPr>
+          <w:p>
+            <w:r/>
+            <w:r>
+              <w:rPr>
+                <w:sz w:val="17"/>
+              </w:rPr>
+              <w:t>Met</w:t>
+            </w:r>
+          </w:p>
+        </w:tc>
+      </w:tr>
+      <w:tr>
+        <w:tc>
+          <w:tcPr>
+            <w:tcW w:type="dxa" w:w="1994"/>
+          </w:tcPr>
+          <w:p>
+            <w:r/>
+            <w:r>
+              <w:rPr>
+                <w:sz w:val="17"/>
+              </w:rPr>
+              <w:t>10</w:t>
+            </w:r>
+          </w:p>
+        </w:tc>
+        <w:tc>
+          <w:tcPr>
+            <w:tcW w:type="dxa" w:w="1994"/>
+          </w:tcPr>
+          <w:p>
+            <w:r/>
+            <w:r>
+              <w:rPr>
+                <w:b/>
+                <w:sz w:val="17"/>
+              </w:rPr>
+              <w:t>No unapproved use of ULSU's name or logo</w:t>
+            </w:r>
+            <w:r>
+              <w:rPr>
+                <w:sz w:val="17"/>
+              </w:rPr>
+              <w:t>; official logo files only</w:t>
+            </w:r>
+          </w:p>
+        </w:tc>
+        <w:tc>
+          <w:tcPr>
+            <w:tcW w:type="dxa" w:w="1994"/>
+          </w:tcPr>
+          <w:p>
+            <w:r/>
+            <w:r>
+              <w:rPr>
+                <w:sz w:val="17"/>
+              </w:rPr>
+              <w:t>Social Media Policy; Brand Guidelines</w:t>
+            </w:r>
+          </w:p>
+        </w:tc>
+        <w:tc>
+          <w:tcPr>
+            <w:tcW w:type="dxa" w:w="1994"/>
+          </w:tcPr>
+          <w:p>
+            <w:r/>
+            <w:r>
+              <w:rPr>
+                <w:sz w:val="17"/>
+              </w:rPr>
+              <w:t>The website doesn't use the logo or any redrawn version. It names ULSU in plain text only.</w:t>
+            </w:r>
+          </w:p>
+        </w:tc>
+        <w:tc>
+          <w:tcPr>
+            <w:tcW w:type="dxa" w:w="1994"/>
+          </w:tcPr>
+          <w:p>
+            <w:r/>
+            <w:r>
+              <w:rPr>
+                <w:sz w:val="17"/>
+              </w:rPr>
+              <w:t>Met</w:t>
+            </w:r>
+          </w:p>
+        </w:tc>
+      </w:tr>
+      <w:tr>
+        <w:tc>
+          <w:tcPr>
+            <w:tcW w:type="dxa" w:w="1994"/>
+          </w:tcPr>
+          <w:p>
+            <w:r/>
+            <w:r>
+              <w:rPr>
+                <w:sz w:val="17"/>
+              </w:rPr>
+              <w:t>11</w:t>
+            </w:r>
+          </w:p>
+        </w:tc>
+        <w:tc>
+          <w:tcPr>
+            <w:tcW w:type="dxa" w:w="1994"/>
+          </w:tcPr>
+          <w:p>
+            <w:r/>
+            <w:r>
+              <w:rPr>
+                <w:sz w:val="17"/>
+              </w:rPr>
+              <w:t xml:space="preserve">Hand </w:t>
+            </w:r>
+            <w:r>
+              <w:rPr>
+                <w:b/>
+                <w:sz w:val="17"/>
+              </w:rPr>
+              <w:t>social media and service logins</w:t>
+            </w:r>
+            <w:r>
+              <w:rPr>
+                <w:sz w:val="17"/>
+              </w:rPr>
+              <w:t xml:space="preserve"> to ULSU at each handover; MFA</w:t>
+            </w:r>
+          </w:p>
+        </w:tc>
+        <w:tc>
+          <w:tcPr>
+            <w:tcW w:type="dxa" w:w="1994"/>
+          </w:tcPr>
+          <w:p>
+            <w:r/>
+            <w:r>
+              <w:rPr>
+                <w:sz w:val="17"/>
+              </w:rPr>
+              <w:t>Social Media Policy</w:t>
+            </w:r>
+          </w:p>
+        </w:tc>
+        <w:tc>
+          <w:tcPr>
+            <w:tcW w:type="dxa" w:w="1994"/>
+          </w:tcPr>
+          <w:p>
+            <w:r/>
+            <w:r>
+              <w:rPr>
+                <w:sz w:val="17"/>
+              </w:rPr>
+              <w:t>Not something the website can do</w:t>
+            </w:r>
+          </w:p>
+        </w:tc>
+        <w:tc>
+          <w:tcPr>
+            <w:tcW w:type="dxa" w:w="1994"/>
+          </w:tcPr>
+          <w:p>
+            <w:r/>
+            <w:r>
+              <w:rPr>
+                <w:b/>
+                <w:sz w:val="17"/>
+              </w:rPr>
+              <w:t>Action needed</w:t>
+            </w:r>
+            <w:r>
+              <w:rPr>
+                <w:sz w:val="17"/>
+              </w:rPr>
+              <w:t xml:space="preserve"> (10.7)</w:t>
+            </w:r>
+          </w:p>
+        </w:tc>
+      </w:tr>
+      <w:tr>
+        <w:tc>
+          <w:tcPr>
+            <w:tcW w:type="dxa" w:w="1994"/>
+          </w:tcPr>
+          <w:p>
+            <w:r/>
+            <w:r>
+              <w:rPr>
+                <w:sz w:val="17"/>
+              </w:rPr>
+              <w:t>12</w:t>
+            </w:r>
+          </w:p>
+        </w:tc>
+        <w:tc>
+          <w:tcPr>
+            <w:tcW w:type="dxa" w:w="1994"/>
+          </w:tcPr>
+          <w:p>
+            <w:r/>
+            <w:r>
+              <w:rPr>
+                <w:sz w:val="17"/>
+              </w:rPr>
+              <w:t>Use the official ULSU group email, not personal addresses</w:t>
+            </w:r>
+          </w:p>
+        </w:tc>
+        <w:tc>
+          <w:tcPr>
+            <w:tcW w:type="dxa" w:w="1994"/>
+          </w:tcPr>
+          <w:p>
+            <w:r/>
+            <w:r>
+              <w:rPr>
+                <w:sz w:val="17"/>
+              </w:rPr>
+              <w:t>Group Gmail Policy</w:t>
+            </w:r>
+          </w:p>
+        </w:tc>
+        <w:tc>
+          <w:tcPr>
+            <w:tcW w:type="dxa" w:w="1994"/>
+          </w:tcPr>
+          <w:p>
+            <w:r/>
+            <w:r>
+              <w:rPr>
+                <w:sz w:val="17"/>
+              </w:rPr>
+              <w:t xml:space="preserve">Site publishes and sends from </w:t>
             </w:r>
             <w:r>
               <w:rPr>
                 <w:rFonts w:ascii="Consolas" w:hAnsi="Consolas"/>
                 <w:sz w:val="18"/>
               </w:rPr>
-              <w:t>compliance@lincolnsu.com</w:t>
-            </w:r>
-            <w:r>
-              <w:rPr>
-                <w:sz w:val="17"/>
-              </w:rPr>
-              <w:t xml:space="preserve">; complaints </w:t>
-            </w:r>
-            <w:r>
-              <w:rPr>
-                <w:rFonts w:ascii="Consolas" w:hAnsi="Consolas"/>
-                <w:sz w:val="18"/>
-              </w:rPr>
-              <w:t>complaints@lincolnsu.com</w:t>
-            </w:r>
-            <w:r>
-              <w:rPr>
-                <w:sz w:val="17"/>
-              </w:rPr>
-              <w:t>; rights include access, correction, deletion, restriction/objection, withdrawing consent, portability; SARs answered within one month; direct right to complain to the controller first, acknowledged within 30 days (DUAA); marketing via consent or charity soft opt-in with free opt-out; children's data minimised; retention: membership records for involvement + up to 6 years, enquiries up to 2 years</w:t>
-            </w:r>
-          </w:p>
-        </w:tc>
-        <w:tc>
-          <w:tcPr>
-            <w:tcW w:type="dxa" w:w="3324"/>
-          </w:tcPr>
-          <w:p>
-            <w:r/>
-            <w:r>
-              <w:rPr>
-                <w:sz w:val="17"/>
-              </w:rPr>
-              <w:t>Our notice uses the same rights list, the one-month time limit and the 30-day complaint acknowledgement; names the ULSU DPO and complaints contacts; email opt-out in place; children's data not collected knowingly. Our retention periods are shorter than ULSU's for data we hold (ULSU keeps the master membership record).</w:t>
-            </w:r>
-          </w:p>
-        </w:tc>
-        <w:tc>
-          <w:tcPr>
-            <w:tcW w:type="dxa" w:w="3324"/>
-          </w:tcPr>
-          <w:p>
-            <w:r/>
-            <w:r>
-              <w:rPr>
-                <w:sz w:val="17"/>
-              </w:rPr>
-              <w:t xml:space="preserve">Done / </w:t>
+              <w:t>acms@lincolnsu.com</w:t>
+            </w:r>
+          </w:p>
+        </w:tc>
+        <w:tc>
+          <w:tcPr>
+            <w:tcW w:type="dxa" w:w="1994"/>
+          </w:tcPr>
+          <w:p>
+            <w:r/>
+            <w:r>
+              <w:rPr>
+                <w:sz w:val="17"/>
+              </w:rPr>
+              <w:t xml:space="preserve">Met; accounts behind the site </w:t>
             </w:r>
             <w:r>
               <w:rPr>
                 <w:b/>
                 <w:sz w:val="17"/>
               </w:rPr>
-              <w:t>ULSU to confirm</w:t>
-            </w:r>
-            <w:r>
-              <w:rPr>
-                <w:sz w:val="17"/>
-              </w:rPr>
-              <w:t xml:space="preserve"> the controller wording</w:t>
+              <w:t>Action needed</w:t>
+            </w:r>
+            <w:r>
+              <w:rPr>
+                <w:sz w:val="17"/>
+              </w:rPr>
+              <w:t xml:space="preserve"> (10.7)</w:t>
             </w:r>
           </w:p>
         </w:tc>
@@ -1623,57 +2709,84 @@
       <w:tr>
         <w:tc>
           <w:tcPr>
-            <w:tcW w:type="dxa" w:w="3324"/>
-          </w:tcPr>
-          <w:p>
-            <w:r/>
+            <w:tcW w:type="dxa" w:w="1994"/>
+          </w:tcPr>
+          <w:p>
+            <w:r/>
+            <w:r>
+              <w:rPr>
+                <w:sz w:val="17"/>
+              </w:rPr>
+              <w:t>13</w:t>
+            </w:r>
+          </w:p>
+        </w:tc>
+        <w:tc>
+          <w:tcPr>
+            <w:tcW w:type="dxa" w:w="1994"/>
+          </w:tcPr>
+          <w:p>
+            <w:r/>
+            <w:r>
+              <w:rPr>
+                <w:sz w:val="17"/>
+              </w:rPr>
+              <w:t xml:space="preserve">Societies have </w:t>
+            </w:r>
             <w:r>
               <w:rPr>
                 <w:b/>
                 <w:sz w:val="17"/>
               </w:rPr>
-              <w:t>Safeguarding of Children and Vulnerable Adults Policy (04/25)</w:t>
-            </w:r>
-            <w:r>
-              <w:rPr>
-                <w:sz w:val="17"/>
-              </w:rPr>
-              <w:t>: committee members are "Student Volunteers" and must report concerns immediately to the Safeguarding Officers (Group Chief Executive and Deputy); do not investigate or promise confidentiality; wellbeing concerns go to University Student Wellbeing (01522 886400); Prevent duty is escalated by the Chief Executive; records kept with restricted access</w:t>
-            </w:r>
-          </w:p>
-        </w:tc>
-        <w:tc>
-          <w:tcPr>
-            <w:tcW w:type="dxa" w:w="3324"/>
-          </w:tcPr>
-          <w:p>
-            <w:r/>
-            <w:r>
-              <w:rPr>
-                <w:rFonts w:ascii="Consolas" w:hAnsi="Consolas"/>
-                <w:sz w:val="18"/>
-              </w:rPr>
-              <w:t>safeguarding.html</w:t>
-            </w:r>
-            <w:r>
-              <w:rPr>
-                <w:sz w:val="17"/>
-              </w:rPr>
-              <w:t xml:space="preserve"> states this route, the urgent-help numbers and the Prevent escalation; dashboard flags safeguarding requests with a reminder to pass them to ULSU and not investigate; chat reports kept as safeguarding records</w:t>
-            </w:r>
-          </w:p>
-        </w:tc>
-        <w:tc>
-          <w:tcPr>
-            <w:tcW w:type="dxa" w:w="3324"/>
-          </w:tcPr>
-          <w:p>
-            <w:r/>
-            <w:r>
-              <w:rPr>
-                <w:sz w:val="17"/>
-              </w:rPr>
-              <w:t>Done</w:t>
+              <w:t>open membership</w:t>
+            </w:r>
+            <w:r>
+              <w:rPr>
+                <w:sz w:val="17"/>
+              </w:rPr>
+              <w:t xml:space="preserve"> and don't restrict by name</w:t>
+            </w:r>
+          </w:p>
+        </w:tc>
+        <w:tc>
+          <w:tcPr>
+            <w:tcW w:type="dxa" w:w="1994"/>
+          </w:tcPr>
+          <w:p>
+            <w:r/>
+            <w:r>
+              <w:rPr>
+                <w:sz w:val="17"/>
+              </w:rPr>
+              <w:t>Equal Opportunities Policy</w:t>
+            </w:r>
+          </w:p>
+        </w:tc>
+        <w:tc>
+          <w:tcPr>
+            <w:tcW w:type="dxa" w:w="1994"/>
+          </w:tcPr>
+          <w:p>
+            <w:r/>
+            <w:r>
+              <w:rPr>
+                <w:sz w:val="17"/>
+              </w:rPr>
+              <w:t>Site says "Open to every course and background"</w:t>
+            </w:r>
+          </w:p>
+        </w:tc>
+        <w:tc>
+          <w:tcPr>
+            <w:tcW w:type="dxa" w:w="1994"/>
+          </w:tcPr>
+          <w:p>
+            <w:r/>
+            <w:r>
+              <w:rPr>
+                <w:sz w:val="17"/>
+              </w:rPr>
+              <w:t>Met</w:t>
             </w:r>
           </w:p>
         </w:tc>
@@ -1681,63 +2794,71 @@
       <w:tr>
         <w:tc>
           <w:tcPr>
-            <w:tcW w:type="dxa" w:w="3324"/>
-          </w:tcPr>
-          <w:p>
-            <w:r/>
-            <w:r>
-              <w:rPr>
-                <w:b/>
-                <w:sz w:val="17"/>
-              </w:rPr>
-              <w:t>Student Members' Social Media Policy (08/26)</w:t>
-            </w:r>
-            <w:r>
-              <w:rPr>
-                <w:sz w:val="17"/>
-              </w:rPr>
-              <w:t>: groups are acting under ULSU's auspices; content must be professional; no harassment, discrimination, explicit content, defamation; no unapproved use of the ULSU name or logo; handover of social media logins to ULSU each year; MFA recommended; AI content must not deceive or impersonate; "mini websites" are managed via the Student Dashboard</w:t>
-            </w:r>
-          </w:p>
-        </w:tc>
-        <w:tc>
-          <w:tcPr>
-            <w:tcW w:type="dxa" w:w="3324"/>
-          </w:tcPr>
-          <w:p>
-            <w:r/>
-            <w:r>
-              <w:rPr>
-                <w:sz w:val="17"/>
-              </w:rPr>
-              <w:t xml:space="preserve">Terms of use prohibit each of these (including deceptive AI content). The site does </w:t>
-            </w:r>
-            <w:r>
-              <w:rPr>
-                <w:b/>
-                <w:sz w:val="17"/>
-              </w:rPr>
-              <w:t>not</w:t>
-            </w:r>
-            <w:r>
-              <w:rPr>
-                <w:sz w:val="17"/>
-              </w:rPr>
-              <w:t xml:space="preserve"> use the ULSU logo.</w:t>
-            </w:r>
-          </w:p>
-        </w:tc>
-        <w:tc>
-          <w:tcPr>
-            <w:tcW w:type="dxa" w:w="3324"/>
-          </w:tcPr>
-          <w:p>
-            <w:r/>
-            <w:r>
-              <w:rPr>
-                <w:sz w:val="17"/>
-              </w:rPr>
-              <w:t>Done; see 10.7 for logins, MFA and whether ULSU wants to approve this independent website</w:t>
+            <w:tcW w:type="dxa" w:w="1994"/>
+          </w:tcPr>
+          <w:p>
+            <w:r/>
+            <w:r>
+              <w:rPr>
+                <w:sz w:val="17"/>
+              </w:rPr>
+              <w:t>14</w:t>
+            </w:r>
+          </w:p>
+        </w:tc>
+        <w:tc>
+          <w:tcPr>
+            <w:tcW w:type="dxa" w:w="1994"/>
+          </w:tcPr>
+          <w:p>
+            <w:r/>
+            <w:r>
+              <w:rPr>
+                <w:sz w:val="17"/>
+              </w:rPr>
+              <w:t>Free speech with lawful, respectful debate; no hate speech</w:t>
+            </w:r>
+          </w:p>
+        </w:tc>
+        <w:tc>
+          <w:tcPr>
+            <w:tcW w:type="dxa" w:w="1994"/>
+          </w:tcPr>
+          <w:p>
+            <w:r/>
+            <w:r>
+              <w:rPr>
+                <w:sz w:val="17"/>
+              </w:rPr>
+              <w:t>Code of Conduct</w:t>
+            </w:r>
+          </w:p>
+        </w:tc>
+        <w:tc>
+          <w:tcPr>
+            <w:tcW w:type="dxa" w:w="1994"/>
+          </w:tcPr>
+          <w:p>
+            <w:r/>
+            <w:r>
+              <w:rPr>
+                <w:sz w:val="17"/>
+              </w:rPr>
+              <w:t>Terms welcome debate and ban harassment and hate</w:t>
+            </w:r>
+          </w:p>
+        </w:tc>
+        <w:tc>
+          <w:tcPr>
+            <w:tcW w:type="dxa" w:w="1994"/>
+          </w:tcPr>
+          <w:p>
+            <w:r/>
+            <w:r>
+              <w:rPr>
+                <w:sz w:val="17"/>
+              </w:rPr>
+              <w:t>Met</w:t>
             </w:r>
           </w:p>
         </w:tc>
@@ -1745,70 +2866,71 @@
       <w:tr>
         <w:tc>
           <w:tcPr>
-            <w:tcW w:type="dxa" w:w="3324"/>
-          </w:tcPr>
-          <w:p>
-            <w:r/>
-            <w:r>
-              <w:rPr>
-                <w:b/>
-                <w:sz w:val="17"/>
-              </w:rPr>
-              <w:t>Group Gmail Access and Onboarding Policy (09/25)</w:t>
-            </w:r>
-            <w:r>
-              <w:rPr>
-                <w:sz w:val="17"/>
-              </w:rPr>
-              <w:t>: societies must use their official ULSU-managed address (not personal addresses); credentials not shared outside the elected committee; annual handover; MFA mandatory</w:t>
-            </w:r>
-          </w:p>
-        </w:tc>
-        <w:tc>
-          <w:tcPr>
-            <w:tcW w:type="dxa" w:w="3324"/>
-          </w:tcPr>
-          <w:p>
-            <w:r/>
-            <w:r>
-              <w:rPr>
-                <w:sz w:val="17"/>
-              </w:rPr>
-              <w:t xml:space="preserve">The website publishes and sends from </w:t>
-            </w:r>
-            <w:r>
-              <w:rPr>
-                <w:rFonts w:ascii="Consolas" w:hAnsi="Consolas"/>
-                <w:sz w:val="18"/>
-              </w:rPr>
-              <w:t>acms@lincolnsu.com</w:t>
-            </w:r>
-            <w:r>
-              <w:rPr>
-                <w:sz w:val="17"/>
-              </w:rPr>
-              <w:t>.</w:t>
-            </w:r>
-          </w:p>
-        </w:tc>
-        <w:tc>
-          <w:tcPr>
-            <w:tcW w:type="dxa" w:w="3324"/>
-          </w:tcPr>
-          <w:p>
-            <w:r/>
-            <w:r>
-              <w:rPr>
-                <w:b/>
-                <w:sz w:val="17"/>
-              </w:rPr>
-              <w:t>Action needed</w:t>
-            </w:r>
-            <w:r>
-              <w:rPr>
-                <w:sz w:val="17"/>
-              </w:rPr>
-              <w:t>: every service account behind the site must use that official address (10.7)</w:t>
+            <w:tcW w:type="dxa" w:w="1994"/>
+          </w:tcPr>
+          <w:p>
+            <w:r/>
+            <w:r>
+              <w:rPr>
+                <w:sz w:val="17"/>
+              </w:rPr>
+              <w:t>15</w:t>
+            </w:r>
+          </w:p>
+        </w:tc>
+        <w:tc>
+          <w:tcPr>
+            <w:tcW w:type="dxa" w:w="1994"/>
+          </w:tcPr>
+          <w:p>
+            <w:r/>
+            <w:r>
+              <w:rPr>
+                <w:sz w:val="17"/>
+              </w:rPr>
+              <w:t>Political neutrality</w:t>
+            </w:r>
+          </w:p>
+        </w:tc>
+        <w:tc>
+          <w:tcPr>
+            <w:tcW w:type="dxa" w:w="1994"/>
+          </w:tcPr>
+          <w:p>
+            <w:r/>
+            <w:r>
+              <w:rPr>
+                <w:sz w:val="17"/>
+              </w:rPr>
+              <w:t>Political Activity Policy</w:t>
+            </w:r>
+          </w:p>
+        </w:tc>
+        <w:tc>
+          <w:tcPr>
+            <w:tcW w:type="dxa" w:w="1994"/>
+          </w:tcPr>
+          <w:p>
+            <w:r/>
+            <w:r>
+              <w:rPr>
+                <w:sz w:val="17"/>
+              </w:rPr>
+              <w:t>The site carries no party-political content</w:t>
+            </w:r>
+          </w:p>
+        </w:tc>
+        <w:tc>
+          <w:tcPr>
+            <w:tcW w:type="dxa" w:w="1994"/>
+          </w:tcPr>
+          <w:p>
+            <w:r/>
+            <w:r>
+              <w:rPr>
+                <w:sz w:val="17"/>
+              </w:rPr>
+              <w:t>Met</w:t>
             </w:r>
           </w:p>
         </w:tc>
@@ -1816,50 +2938,84 @@
       <w:tr>
         <w:tc>
           <w:tcPr>
-            <w:tcW w:type="dxa" w:w="3324"/>
-          </w:tcPr>
-          <w:p>
-            <w:r/>
-            <w:r>
-              <w:rPr>
-                <w:sz w:val="17"/>
-              </w:rPr>
-              <w:t>Code of Conduct 2026-27, Equal Opportunities Policy, Complaints Handbook, Terms &amp; Conditions, Cookie Policy, UL/ULSU Data Sharing Agreement</w:t>
-            </w:r>
-          </w:p>
-        </w:tc>
-        <w:tc>
-          <w:tcPr>
-            <w:tcW w:type="dxa" w:w="3324"/>
-          </w:tcPr>
-          <w:p>
-            <w:r/>
+            <w:tcW w:type="dxa" w:w="1994"/>
+          </w:tcPr>
+          <w:p>
+            <w:r/>
+            <w:r>
+              <w:rPr>
+                <w:sz w:val="17"/>
+              </w:rPr>
+              <w:t>16</w:t>
+            </w:r>
+          </w:p>
+        </w:tc>
+        <w:tc>
+          <w:tcPr>
+            <w:tcW w:type="dxa" w:w="1994"/>
+          </w:tcPr>
+          <w:p>
+            <w:r/>
+            <w:r>
+              <w:rPr>
+                <w:sz w:val="17"/>
+              </w:rPr>
+              <w:t xml:space="preserve">Committee </w:t>
+            </w:r>
             <w:r>
               <w:rPr>
                 <w:b/>
                 <w:sz w:val="17"/>
               </w:rPr>
-              <w:t>Not read in full</w:t>
-            </w:r>
-            <w:r>
-              <w:rPr>
-                <w:sz w:val="17"/>
-              </w:rPr>
-              <w:t xml:space="preserve"> (titles and links only)</w:t>
-            </w:r>
-          </w:p>
-        </w:tc>
-        <w:tc>
-          <w:tcPr>
-            <w:tcW w:type="dxa" w:w="3324"/>
-          </w:tcPr>
-          <w:p>
-            <w:r/>
-            <w:r>
-              <w:rPr>
-                <w:sz w:val="17"/>
-              </w:rPr>
-              <w:t>The terms and accessibility pages point to ULSU's complaints route and reflect the equality principle</w:t>
+              <w:t>attend required induction and training</w:t>
+            </w:r>
+            <w:r>
+              <w:rPr>
+                <w:sz w:val="17"/>
+              </w:rPr>
+              <w:t>; confidentiality of information held through the role</w:t>
+            </w:r>
+          </w:p>
+        </w:tc>
+        <w:tc>
+          <w:tcPr>
+            <w:tcW w:type="dxa" w:w="1994"/>
+          </w:tcPr>
+          <w:p>
+            <w:r/>
+            <w:r>
+              <w:rPr>
+                <w:sz w:val="17"/>
+              </w:rPr>
+              <w:t>Code of Conduct</w:t>
+            </w:r>
+          </w:p>
+        </w:tc>
+        <w:tc>
+          <w:tcPr>
+            <w:tcW w:type="dxa" w:w="1994"/>
+          </w:tcPr>
+          <w:p>
+            <w:r/>
+            <w:r>
+              <w:rPr>
+                <w:sz w:val="17"/>
+              </w:rPr>
+              <w:t>Covered by item 1 and the annual handover checklist (8.4)</w:t>
+            </w:r>
+          </w:p>
+        </w:tc>
+        <w:tc>
+          <w:tcPr>
+            <w:tcW w:type="dxa" w:w="1994"/>
+          </w:tcPr>
+          <w:p>
+            <w:r/>
+            <w:r>
+              <w:rPr>
+                <w:sz w:val="17"/>
+              </w:rPr>
+              <w:t>Action needed (10.16)</w:t>
             </w:r>
           </w:p>
         </w:tc>
@@ -6608,6 +7764,14 @@
         <w:pStyle w:val="ListBullet"/>
       </w:pPr>
       <w:r>
+        <w:t>Check that every committee member has confirmed their data protection training (Data &amp; Privacy, bottom of the page).</w:t>
+      </w:r>
+    </w:p>
+    <w:p>
+      <w:pPr>
+        <w:pStyle w:val="ListBullet"/>
+      </w:pPr>
+      <w:r>
         <w:t xml:space="preserve">Review the privacy notice, bump the version in </w:t>
       </w:r>
       <w:r>
@@ -6746,7 +7910,17 @@
         <w:t>js/privacy-admin.js</w:t>
       </w:r>
       <w:r>
-        <w:t xml:space="preserve"> (dashboard).</w:t>
+        <w:t xml:space="preserve"> (dashboard), </w:t>
+      </w:r>
+      <w:r>
+        <w:rPr>
+          <w:rFonts w:ascii="Consolas" w:hAnsi="Consolas"/>
+          <w:sz w:val="18"/>
+        </w:rPr>
+        <w:t>js/committee-ack.js</w:t>
+      </w:r>
+      <w:r>
+        <w:t xml:space="preserve"> (yearly committee training confirmation).</w:t>
       </w:r>
     </w:p>
     <w:p>
@@ -6765,6 +7939,16 @@
           <w:sz w:val="18"/>
         </w:rPr>
         <w:t>db/migrations/110-data-protection-compliance.sql</w:t>
+      </w:r>
+      <w:r>
+        <w:t xml:space="preserve"> and </w:t>
+      </w:r>
+      <w:r>
+        <w:rPr>
+          <w:rFonts w:ascii="Consolas" w:hAnsi="Consolas"/>
+          <w:sz w:val="18"/>
+        </w:rPr>
+        <w:t>db/migrations/111-committee-data-protection-acknowledgement.sql</w:t>
       </w:r>
       <w:r>
         <w:t>.</w:t>
@@ -7340,7 +8524,7 @@
               <w:rPr>
                 <w:sz w:val="17"/>
               </w:rPr>
-              <w:t>. Decide with ULSU whether the privacy notice should describe recipients and overseas transfers (it currently doesn't).</w:t>
+              <w:t xml:space="preserve"> (ULSU's agreement with the University says student data isn't exported outside the EEA without adequate protection, so an EU/UK region and Resend's EU option are the safe choices). Decide with ULSU whether the privacy notice should describe recipients and overseas transfers (it currently doesn't).</w:t>
             </w:r>
           </w:p>
         </w:tc>
@@ -7567,7 +8751,7 @@
               <w:rPr>
                 <w:sz w:val="17"/>
               </w:rPr>
-              <w:t xml:space="preserve"> position: is LACMS covered by ULSU's data protection fee, or does it need its own?</w:t>
+              <w:t xml:space="preserve"> position: is LACMS covered by ULSU's data protection registration (ULSU is registered with the ICO under number 23259886 according to its published agreement with the University), or does it need its own?</w:t>
             </w:r>
           </w:p>
         </w:tc>
@@ -8185,6 +9369,19 @@
                 <w:b/>
                 <w:sz w:val="17"/>
               </w:rPr>
+              <w:t>Non-student participation and the Network directory.</w:t>
+            </w:r>
+            <w:r>
+              <w:rPr>
+                <w:sz w:val="17"/>
+              </w:rPr>
+              <w:t xml:space="preserve"> (a) ULSU's Non-Student Membership Policy says non-students take part in society activity only through a non-student membership type and cannot hold committee roles. Ask ULSU how healthcare professionals (mentors, speakers, Network users) may take part. (b) </w:t>
+            </w:r>
+            <w:r>
+              <w:rPr>
+                <w:b/>
+                <w:sz w:val="17"/>
+              </w:rPr>
               <w:t>The Network directory:</w:t>
             </w:r>
             <w:r>
@@ -8192,6 +9389,203 @@
                 <w:sz w:val="17"/>
               </w:rPr>
               <w:t xml:space="preserve"> every active member is listed (name, course, year, plus any LinkedIn/bio they add) to everyone given Network access, which can include approved external healthcare professionals. Members cannot currently hide themselves (only the committee can). The Network is closed by default and opened by the committee in Hub Access. Before opening it, decide whether it should be opt-in or have a self-service "hide me", and ask ULSU whether it is happy with membership details being used this way.</w:t>
+            </w:r>
+          </w:p>
+        </w:tc>
+        <w:tc>
+          <w:tcPr>
+            <w:tcW w:type="dxa" w:w="2493"/>
+          </w:tcPr>
+          <w:p>
+            <w:r/>
+            <w:r>
+              <w:rPr>
+                <w:sz w:val="17"/>
+              </w:rPr>
+              <w:t>Committee, with ULSU</w:t>
+            </w:r>
+          </w:p>
+        </w:tc>
+      </w:tr>
+      <w:tr>
+        <w:tc>
+          <w:tcPr>
+            <w:tcW w:type="dxa" w:w="2493"/>
+          </w:tcPr>
+          <w:p>
+            <w:r/>
+            <w:r>
+              <w:rPr>
+                <w:sz w:val="17"/>
+              </w:rPr>
+              <w:t>10.16</w:t>
+            </w:r>
+          </w:p>
+        </w:tc>
+        <w:tc>
+          <w:tcPr>
+            <w:tcW w:type="dxa" w:w="2493"/>
+          </w:tcPr>
+          <w:p>
+            <w:r/>
+            <w:r>
+              <w:rPr>
+                <w:b/>
+                <w:sz w:val="17"/>
+              </w:rPr>
+              <w:t>High</w:t>
+            </w:r>
+          </w:p>
+        </w:tc>
+        <w:tc>
+          <w:tcPr>
+            <w:tcW w:type="dxa" w:w="2493"/>
+          </w:tcPr>
+          <w:p>
+            <w:r/>
+            <w:r>
+              <w:rPr>
+                <w:b/>
+                <w:sz w:val="17"/>
+              </w:rPr>
+              <w:t>Committee data protection training.</w:t>
+            </w:r>
+            <w:r>
+              <w:rPr>
+                <w:sz w:val="17"/>
+              </w:rPr>
+              <w:t xml:space="preserve"> ULSU's Code of Conduct requires it before committee members access personal data. Ask ULSU for the training and have every committee member complete it; the dashboard records each person's yearly confirmation and reminds anyone who says "not yet". Decide whether you would rather block dashboard access until it is confirmed (the site records and reminds, it doesn't block).</w:t>
+            </w:r>
+          </w:p>
+        </w:tc>
+        <w:tc>
+          <w:tcPr>
+            <w:tcW w:type="dxa" w:w="2493"/>
+          </w:tcPr>
+          <w:p>
+            <w:r/>
+            <w:r>
+              <w:rPr>
+                <w:sz w:val="17"/>
+              </w:rPr>
+              <w:t>Committee, with ULSU</w:t>
+            </w:r>
+          </w:p>
+        </w:tc>
+      </w:tr>
+      <w:tr>
+        <w:tc>
+          <w:tcPr>
+            <w:tcW w:type="dxa" w:w="2493"/>
+          </w:tcPr>
+          <w:p>
+            <w:r/>
+            <w:r>
+              <w:rPr>
+                <w:sz w:val="17"/>
+              </w:rPr>
+              <w:t>10.17</w:t>
+            </w:r>
+          </w:p>
+        </w:tc>
+        <w:tc>
+          <w:tcPr>
+            <w:tcW w:type="dxa" w:w="2493"/>
+          </w:tcPr>
+          <w:p>
+            <w:r/>
+            <w:r>
+              <w:rPr>
+                <w:b/>
+                <w:sz w:val="17"/>
+              </w:rPr>
+              <w:t>High</w:t>
+            </w:r>
+          </w:p>
+        </w:tc>
+        <w:tc>
+          <w:tcPr>
+            <w:tcW w:type="dxa" w:w="2493"/>
+          </w:tcPr>
+          <w:p>
+            <w:r/>
+            <w:r>
+              <w:rPr>
+                <w:b/>
+                <w:sz w:val="17"/>
+              </w:rPr>
+              <w:t>External speakers.</w:t>
+            </w:r>
+            <w:r>
+              <w:rPr>
+                <w:sz w:val="17"/>
+              </w:rPr>
+              <w:t xml:space="preserve"> Any event with a speaker who isn't a current Lincoln student or staff member (doctors, professionals, mentors giving a talk) must be cleared by ULSU through the Student Dashboard at least 10 working days ahead, and not publicised until cleared. Check every event currently on the events page and the Sankofa sessions, and keep any uncleared one off the website until cleared.</w:t>
+            </w:r>
+          </w:p>
+        </w:tc>
+        <w:tc>
+          <w:tcPr>
+            <w:tcW w:type="dxa" w:w="2493"/>
+          </w:tcPr>
+          <w:p>
+            <w:r/>
+            <w:r>
+              <w:rPr>
+                <w:sz w:val="17"/>
+              </w:rPr>
+              <w:t>Committee</w:t>
+            </w:r>
+          </w:p>
+        </w:tc>
+      </w:tr>
+      <w:tr>
+        <w:tc>
+          <w:tcPr>
+            <w:tcW w:type="dxa" w:w="2493"/>
+          </w:tcPr>
+          <w:p>
+            <w:r/>
+            <w:r>
+              <w:rPr>
+                <w:sz w:val="17"/>
+              </w:rPr>
+              <w:t>10.18</w:t>
+            </w:r>
+          </w:p>
+        </w:tc>
+        <w:tc>
+          <w:tcPr>
+            <w:tcW w:type="dxa" w:w="2493"/>
+          </w:tcPr>
+          <w:p>
+            <w:r/>
+            <w:r>
+              <w:rPr>
+                <w:sz w:val="17"/>
+              </w:rPr>
+              <w:t>Medium</w:t>
+            </w:r>
+          </w:p>
+        </w:tc>
+        <w:tc>
+          <w:tcPr>
+            <w:tcW w:type="dxa" w:w="2493"/>
+          </w:tcPr>
+          <w:p>
+            <w:r/>
+            <w:r>
+              <w:rPr>
+                <w:b/>
+                <w:sz w:val="17"/>
+              </w:rPr>
+              <w:t>Fundraising.</w:t>
+            </w:r>
+            <w:r>
+              <w:rPr>
+                <w:sz w:val="17"/>
+              </w:rPr>
+              <w:t xml:space="preserve"> The events page advertises a Winter Charity Fundraiser. ULSU's Code says all money must go through ULSU and raising funds for an outside cause needs the Trustees' permission. Read ULSU's Fundraising Policy and agree the plan with ULSU before promoting it further.</w:t>
             </w:r>
           </w:p>
         </w:tc>
@@ -8279,6 +9673,29 @@
         <w:rPr>
           <w:b/>
         </w:rPr>
+        <w:t>Migration 111:</w:t>
+      </w:r>
+      <w:r>
+        <w:t xml:space="preserve"> 10 automated checks (confirm, update, permissions, listing). </w:t>
+      </w:r>
+      <w:r>
+        <w:rPr>
+          <w:b/>
+        </w:rPr>
+        <w:t>Browser:</w:t>
+      </w:r>
+      <w:r>
+        <w:t xml:space="preserve"> the yearly confirmation, the "not yet" reminder and the president's list were run against the mock server.</w:t>
+      </w:r>
+    </w:p>
+    <w:p>
+      <w:pPr>
+        <w:pStyle w:val="ListBullet"/>
+      </w:pPr>
+      <w:r>
+        <w:rPr>
+          <w:b/>
+        </w:rPr>
         <w:t>Not done:</w:t>
       </w:r>
       <w:r>
@@ -8878,6 +10295,78 @@
       </w:pPr>
       <w:r>
         <w:t>Appendix C: Sources read</w:t>
+      </w:r>
+    </w:p>
+    <w:p>
+      <w:pPr>
+        <w:pStyle w:val="ListBullet"/>
+      </w:pPr>
+      <w:r>
+        <w:t>ULSU Code of Conduct 2026/27</w:t>
+      </w:r>
+    </w:p>
+    <w:p>
+      <w:pPr>
+        <w:pStyle w:val="ListBullet"/>
+      </w:pPr>
+      <w:r>
+        <w:t>ULSU Non-Student Membership Policy (03/26)</w:t>
+      </w:r>
+    </w:p>
+    <w:p>
+      <w:pPr>
+        <w:pStyle w:val="ListBullet"/>
+      </w:pPr>
+      <w:r>
+        <w:t>ULSU External Speakers Policy (06/25)</w:t>
+      </w:r>
+    </w:p>
+    <w:p>
+      <w:pPr>
+        <w:pStyle w:val="ListBullet"/>
+      </w:pPr>
+      <w:r>
+        <w:t>ULSU Political Activity Policy (06/26)</w:t>
+      </w:r>
+    </w:p>
+    <w:p>
+      <w:pPr>
+        <w:pStyle w:val="ListBullet"/>
+      </w:pPr>
+      <w:r>
+        <w:t>ULSU Equal Opportunities Policy</w:t>
+      </w:r>
+    </w:p>
+    <w:p>
+      <w:pPr>
+        <w:pStyle w:val="ListBullet"/>
+      </w:pPr>
+      <w:r>
+        <w:t>ULSU Complaints Handbook (03/26)</w:t>
+      </w:r>
+    </w:p>
+    <w:p>
+      <w:pPr>
+        <w:pStyle w:val="ListBullet"/>
+      </w:pPr>
+      <w:r>
+        <w:t>University of Lincoln and ULSU Group Information Sharing Agreement (2022)</w:t>
+      </w:r>
+    </w:p>
+    <w:p>
+      <w:pPr>
+        <w:pStyle w:val="ListBullet"/>
+      </w:pPr>
+      <w:r>
+        <w:t>Lincoln Students' Union Brand Guidelines (08/22)</w:t>
+      </w:r>
+    </w:p>
+    <w:p>
+      <w:pPr>
+        <w:pStyle w:val="ListBullet"/>
+      </w:pPr>
+      <w:r>
+        <w:t>ULSU Student Code of Practice</w:t>
       </w:r>
     </w:p>
     <w:p>

</xml_diff>

<commit_message>
Remove developer connection message and top banner; Network opt-in for members; provisional events with register interest (migration 112)
Co-Authored-By: Claude Sonnet 5.5 <noreply@anthropic.com>
</commit_message>
<xml_diff>
--- a/LACMS-Compliance-Report.docx
+++ b/LACMS-Compliance-Report.docx
@@ -1766,7 +1766,7 @@
                 <w:b/>
                 <w:sz w:val="17"/>
               </w:rPr>
-              <w:t>External speakers</w:t>
+              <w:t>Events and external speakers</w:t>
             </w:r>
             <w:r>
               <w:rPr>
@@ -1807,7 +1807,33 @@
               <w:rPr>
                 <w:sz w:val="17"/>
               </w:rPr>
-              <w:t>The event editor now warns committee members before publishing; the professional request form says offering to speak isn't an invitation. Whether any existing event has an uncleared external speaker can't be checked from the code.</w:t>
+              <w:t xml:space="preserve">Events can be marked </w:t>
+            </w:r>
+            <w:r>
+              <w:rPr>
+                <w:b/>
+                <w:sz w:val="17"/>
+              </w:rPr>
+              <w:t>Provisional</w:t>
+            </w:r>
+            <w:r>
+              <w:rPr>
+                <w:sz w:val="17"/>
+              </w:rPr>
+              <w:t xml:space="preserve"> (migration 112): they show a Provisional badge and members can only </w:t>
+            </w:r>
+            <w:r>
+              <w:rPr>
+                <w:i/>
+                <w:sz w:val="17"/>
+              </w:rPr>
+              <w:t>register interest</w:t>
+            </w:r>
+            <w:r>
+              <w:rPr>
+                <w:sz w:val="17"/>
+              </w:rPr>
+              <w:t xml:space="preserve"> until ULSU approves and the committee switches them to Confirmed. The event editor warns committee members before publishing; the professional request form says offering to speak isn't an invitation. Whether any existing event has an uncleared external speaker can't be checked from the code.</w:t>
             </w:r>
           </w:p>
         </w:tc>
@@ -4938,6 +4964,19 @@
               <w:rPr>
                 <w:sz w:val="17"/>
               </w:rPr>
+              <w:t>), Network choice (</w:t>
+            </w:r>
+            <w:r>
+              <w:rPr>
+                <w:rFonts w:ascii="Consolas" w:hAnsi="Consolas"/>
+                <w:sz w:val="18"/>
+              </w:rPr>
+              <w:t>network_visibility</w:t>
+            </w:r>
+            <w:r>
+              <w:rPr>
+                <w:sz w:val="17"/>
+              </w:rPr>
               <w:t>)</w:t>
             </w:r>
           </w:p>
@@ -4966,7 +5005,7 @@
               <w:rPr>
                 <w:sz w:val="17"/>
               </w:rPr>
-              <w:t>Network</w:t>
+              <w:t>Network (only if they opt in)</w:t>
             </w:r>
           </w:p>
         </w:tc>
@@ -4978,9 +5017,10 @@
             <w:r/>
             <w:r>
               <w:rPr>
-                <w:sz w:val="17"/>
-              </w:rPr>
-              <w:t>Legitimate interests</w:t>
+                <w:b/>
+                <w:sz w:val="17"/>
+              </w:rPr>
+              <w:t>Consent</w:t>
             </w:r>
           </w:p>
         </w:tc>
@@ -4994,7 +5034,7 @@
               <w:rPr>
                 <w:sz w:val="17"/>
               </w:rPr>
-              <w:t>Signed-in members</w:t>
+              <w:t>People with Network access</w:t>
             </w:r>
           </w:p>
         </w:tc>
@@ -7941,6 +7981,16 @@
         <w:t>db/migrations/110-data-protection-compliance.sql</w:t>
       </w:r>
       <w:r>
+        <w:t xml:space="preserve">, </w:t>
+      </w:r>
+      <w:r>
+        <w:rPr>
+          <w:rFonts w:ascii="Consolas" w:hAnsi="Consolas"/>
+          <w:sz w:val="18"/>
+        </w:rPr>
+        <w:t>111-committee-data-protection-acknowledgement.sql</w:t>
+      </w:r>
+      <w:r>
         <w:t xml:space="preserve"> and </w:t>
       </w:r>
       <w:r>
@@ -7948,7 +7998,7 @@
           <w:rFonts w:ascii="Consolas" w:hAnsi="Consolas"/>
           <w:sz w:val="18"/>
         </w:rPr>
-        <w:t>db/migrations/111-committee-data-protection-acknowledgement.sql</w:t>
+        <w:t>112-network-opt-in-and-event-interest.sql</w:t>
       </w:r>
       <w:r>
         <w:t>.</w:t>
@@ -9382,13 +9432,26 @@
                 <w:b/>
                 <w:sz w:val="17"/>
               </w:rPr>
-              <w:t>The Network directory:</w:t>
-            </w:r>
-            <w:r>
-              <w:rPr>
-                <w:sz w:val="17"/>
-              </w:rPr>
-              <w:t xml:space="preserve"> every active member is listed (name, course, year, plus any LinkedIn/bio they add) to everyone given Network access, which can include approved external healthcare professionals. Members cannot currently hide themselves (only the committee can). The Network is closed by default and opened by the committee in Hub Access. Before opening it, decide whether it should be opt-in or have a self-service "hide me", and ask ULSU whether it is happy with membership details being used this way.</w:t>
+              <w:t>The Network directory</w:t>
+            </w:r>
+            <w:r>
+              <w:rPr>
+                <w:sz w:val="17"/>
+              </w:rPr>
+              <w:t xml:space="preserve"> is now </w:t>
+            </w:r>
+            <w:r>
+              <w:rPr>
+                <w:b/>
+                <w:sz w:val="17"/>
+              </w:rPr>
+              <w:t>opt-in</w:t>
+            </w:r>
+            <w:r>
+              <w:rPr>
+                <w:sz w:val="17"/>
+              </w:rPr>
+              <w:t xml:space="preserve"> (migration 112): members appear only after choosing "Show me in the Network", can take themselves off at any time, and email addresses are never shown. Healthcare professionals are listed on the consent they give on their request form. Still ask ULSU whether it is happy with this directory, and whether professionals should see it.</w:t>
             </w:r>
           </w:p>
         </w:tc>

</xml_diff>

<commit_message>
Change notice and report date from 30 October to 30 September 2026 (privacy version 2026-09-30)
Co-Authored-By: Claude Sonnet 5.5 <noreply@anthropic.com>
</commit_message>
<xml_diff>
--- a/LACMS-Compliance-Report.docx
+++ b/LACMS-Compliance-Report.docx
@@ -40,7 +40,7 @@
         <w:t>Report date:</w:t>
       </w:r>
       <w:r>
-        <w:t xml:space="preserve"> 30 October 2026 (version 1.0)</w:t>
+        <w:t xml:space="preserve"> 30 September 2026 (version 1.0)</w:t>
       </w:r>
     </w:p>
     <w:p>
@@ -51,7 +51,7 @@
         <w:t>Privacy notice version this report matches:</w:t>
       </w:r>
       <w:r>
-        <w:t xml:space="preserve"> 2026-10-30</w:t>
+        <w:t xml:space="preserve"> 2026-09-30</w:t>
       </w:r>
     </w:p>
     <w:p>

</xml_diff>

<commit_message>
Network: members listed by default with a ticked box they can untick (migration 113); update privacy notice and compliance documents
Co-Authored-By: Claude Sonnet 5.5 <noreply@anthropic.com>
</commit_message>
<xml_diff>
--- a/LACMS-Compliance-Report.docx
+++ b/LACMS-Compliance-Report.docx
@@ -5005,7 +5005,7 @@
               <w:rPr>
                 <w:sz w:val="17"/>
               </w:rPr>
-              <w:t>Network (only if they opt in)</w:t>
+              <w:t>Network (listed by default; members can opt out)</w:t>
             </w:r>
           </w:p>
         </w:tc>
@@ -5020,7 +5020,7 @@
                 <w:b/>
                 <w:sz w:val="17"/>
               </w:rPr>
-              <w:t>Consent</w:t>
+              <w:t>Legitimate interests, with an easy opt-out</w:t>
             </w:r>
           </w:p>
         </w:tc>
@@ -7998,7 +7998,7 @@
           <w:rFonts w:ascii="Consolas" w:hAnsi="Consolas"/>
           <w:sz w:val="18"/>
         </w:rPr>
-        <w:t>112-network-opt-in-and-event-interest.sql</w:t>
+        <w:t>112-network-opt-in-and-event-interest.sql and 113-network-listed-by-default.sql</w:t>
       </w:r>
       <w:r>
         <w:t>.</w:t>
@@ -9445,13 +9445,13 @@
                 <w:b/>
                 <w:sz w:val="17"/>
               </w:rPr>
-              <w:t>opt-in</w:t>
-            </w:r>
-            <w:r>
-              <w:rPr>
-                <w:sz w:val="17"/>
-              </w:rPr>
-              <w:t xml:space="preserve"> (migration 112): members appear only after choosing "Show me in the Network", can take themselves off at any time, and email addresses are never shown. Healthcare professionals are listed on the consent they give on their request form. Still ask ULSU whether it is happy with this directory, and whether professionals should see it.</w:t>
+              <w:t>listed by default</w:t>
+            </w:r>
+            <w:r>
+              <w:rPr>
+                <w:sz w:val="17"/>
+              </w:rPr>
+              <w:t xml:space="preserve"> (migration 113, which replaced the opt-in of 112): the "Show me in the Network" box is ticked for everyone, anyone can untick it and is removed straight away, and email addresses are never shown. Because a pre-ticked box is not valid consent, the privacy notice treats this as legitimate interests with an easy opt-out; the committee should be comfortable with that, and may wish to tell members before it goes live. Healthcare professionals are listed on the consent they give on their request form. Still ask ULSU whether it is happy with this directory, and whether professionals should see it.</w:t>
             </w:r>
           </w:p>
         </w:tc>

</xml_diff>